<commit_message>
Densify Alignerr CV: tighter summary, DSM-only naming, full hyperlink set.
</commit_message>
<xml_diff>
--- a/Agostino_Scalzullo_Alignerr_CV.docx
+++ b/Agostino_Scalzullo_Alignerr_CV.docx
@@ -4,16 +4,13 @@
   <w:body>
     <w:p>
       <w:pPr>
-        <w:keepNext w:val="0"/>
-        <w:widowControl/>
         <w:spacing w:before="0" w:after="40" w:line="264" w:lineRule="auto"/>
         <w:jc w:val="center"/>
       </w:pPr>
       <w:r>
         <w:rPr>
-          <w:rFonts w:ascii="Calibri" w:hAnsi="Calibri" w:eastAsia="Calibri" w:cs="Calibri"/>
+          <w:rFonts w:ascii="Calibri" w:hAnsi="Calibri" w:cs="Calibri"/>
           <w:b/>
-          <w:i w:val="0"/>
           <w:sz w:val="36"/>
         </w:rPr>
         <w:t>AGOSTINO SCALZULLO</w:t>
@@ -21,31 +18,37 @@
     </w:p>
     <w:p>
       <w:pPr>
-        <w:keepNext w:val="0"/>
-        <w:widowControl/>
         <w:spacing w:before="0" w:after="20" w:line="264" w:lineRule="auto"/>
         <w:jc w:val="center"/>
       </w:pPr>
       <w:r>
         <w:rPr>
-          <w:rFonts w:ascii="Calibri" w:hAnsi="Calibri" w:eastAsia="Calibri" w:cs="Calibri"/>
-          <w:b w:val="0"/>
-          <w:i w:val="0"/>
+          <w:rFonts w:ascii="Calibri" w:hAnsi="Calibri" w:cs="Calibri"/>
           <w:sz w:val="19"/>
         </w:rPr>
-        <w:t>Professional name: Ostin Solo</w:t>
+        <w:t xml:space="preserve">Professional name: </w:t>
       </w:r>
+      <w:hyperlink r:id="rId11">
+        <w:r>
+          <w:rPr>
+            <w:rFonts w:ascii="Calibri" w:hAnsi="Calibri" w:cs="Calibri"/>
+            <w:sz w:val="19"/>
+            <w:szCs w:val="19"/>
+            <w:u w:val="single"/>
+            <w:color w:val="0563C1"/>
+          </w:rPr>
+          <w:t xml:space="preserve">Ostin Solo</w:t>
+        </w:r>
+      </w:hyperlink>
     </w:p>
     <w:p>
       <w:pPr>
-        <w:keepNext w:val="0"/>
-        <w:widowControl/>
         <w:spacing w:before="0" w:after="20" w:line="264" w:lineRule="auto"/>
         <w:jc w:val="center"/>
       </w:pPr>
       <w:r>
         <w:rPr>
-          <w:rFonts w:ascii="Calibri" w:hAnsi="Calibri"/>
+          <w:rFonts w:ascii="Calibri" w:hAnsi="Calibri" w:cs="Calibri"/>
           <w:sz w:val="19"/>
         </w:rPr>
         <w:t xml:space="preserve">London, United Kingdom  |  +44 7999 012772  |  </w:t>
@@ -56,8 +59,8 @@
             <w:rFonts w:ascii="Calibri" w:hAnsi="Calibri" w:cs="Calibri"/>
             <w:sz w:val="19"/>
             <w:szCs w:val="19"/>
-            <w:color w:val="0563C1" w:themeColor="hyperlink"/>
             <w:u w:val="single"/>
+            <w:color w:val="0563C1"/>
           </w:rPr>
           <w:t xml:space="preserve">soloostin@aol.com</w:t>
         </w:r>
@@ -65,8 +68,6 @@
     </w:p>
     <w:p>
       <w:pPr>
-        <w:keepNext w:val="0"/>
-        <w:widowControl/>
         <w:spacing w:before="0" w:after="20" w:line="264" w:lineRule="auto"/>
         <w:jc w:val="center"/>
       </w:pPr>
@@ -76,15 +77,15 @@
             <w:rFonts w:ascii="Calibri" w:hAnsi="Calibri" w:cs="Calibri"/>
             <w:sz w:val="19"/>
             <w:szCs w:val="19"/>
-            <w:color w:val="0563C1" w:themeColor="hyperlink"/>
             <w:u w:val="single"/>
+            <w:color w:val="0563C1"/>
           </w:rPr>
           <w:t xml:space="preserve">LinkedIn</w:t>
         </w:r>
       </w:hyperlink>
       <w:r>
         <w:rPr>
-          <w:rFonts w:ascii="Calibri" w:hAnsi="Calibri"/>
+          <w:rFonts w:ascii="Calibri" w:hAnsi="Calibri" w:cs="Calibri"/>
           <w:sz w:val="19"/>
         </w:rPr>
         <w:t xml:space="preserve">  |  </w:t>
@@ -95,15 +96,15 @@
             <w:rFonts w:ascii="Calibri" w:hAnsi="Calibri" w:cs="Calibri"/>
             <w:sz w:val="19"/>
             <w:szCs w:val="19"/>
-            <w:color w:val="0563C1" w:themeColor="hyperlink"/>
             <w:u w:val="single"/>
+            <w:color w:val="0563C1"/>
           </w:rPr>
           <w:t xml:space="preserve">GitHub</w:t>
         </w:r>
       </w:hyperlink>
       <w:r>
         <w:rPr>
-          <w:rFonts w:ascii="Calibri" w:hAnsi="Calibri"/>
+          <w:rFonts w:ascii="Calibri" w:hAnsi="Calibri" w:cs="Calibri"/>
           <w:sz w:val="19"/>
         </w:rPr>
         <w:t xml:space="preserve">  |  </w:t>
@@ -114,15 +115,15 @@
             <w:rFonts w:ascii="Calibri" w:hAnsi="Calibri" w:cs="Calibri"/>
             <w:sz w:val="19"/>
             <w:szCs w:val="19"/>
-            <w:color w:val="0563C1" w:themeColor="hyperlink"/>
             <w:u w:val="single"/>
+            <w:color w:val="0563C1"/>
           </w:rPr>
           <w:t xml:space="preserve">ostinsolo.co.uk</w:t>
         </w:r>
       </w:hyperlink>
       <w:r>
         <w:rPr>
-          <w:rFonts w:ascii="Calibri" w:hAnsi="Calibri"/>
+          <w:rFonts w:ascii="Calibri" w:hAnsi="Calibri" w:cs="Calibri"/>
           <w:sz w:val="19"/>
         </w:rPr>
         <w:t xml:space="preserve">  |  </w:t>
@@ -133,8 +134,8 @@
             <w:rFonts w:ascii="Calibri" w:hAnsi="Calibri" w:cs="Calibri"/>
             <w:sz w:val="19"/>
             <w:szCs w:val="19"/>
-            <w:color w:val="0563C1" w:themeColor="hyperlink"/>
             <w:u w:val="single"/>
+            <w:color w:val="0563C1"/>
           </w:rPr>
           <w:t xml:space="preserve">vstopia.com</w:t>
         </w:r>
@@ -142,16 +143,13 @@
     </w:p>
     <w:p>
       <w:pPr>
-        <w:keepNext w:val="0"/>
-        <w:widowControl/>
         <w:spacing w:before="80" w:after="120" w:line="264" w:lineRule="auto"/>
         <w:jc w:val="center"/>
       </w:pPr>
       <w:r>
         <w:rPr>
-          <w:rFonts w:ascii="Calibri" w:hAnsi="Calibri" w:eastAsia="Calibri" w:cs="Calibri"/>
+          <w:rFonts w:ascii="Calibri" w:hAnsi="Calibri" w:cs="Calibri"/>
           <w:b/>
-          <w:i w:val="0"/>
           <w:sz w:val="20"/>
         </w:rPr>
         <w:t>AI AUDIO EVALUATOR  |  AUDIO QUALITY REVIEWER  |  AI SYSTEMS SPECIALIST</w:t>
@@ -160,34 +158,28 @@
     <w:p>
       <w:pPr>
         <w:keepNext/>
-        <w:widowControl/>
         <w:spacing w:before="200" w:after="80" w:line="264" w:lineRule="auto"/>
-        <w:pBdr>
-          <w:bottom w:val="single" w:sz="6" w:space="1" w:color="666666"/>
-        </w:pBdr>
       </w:pPr>
       <w:r>
         <w:rPr>
-          <w:rFonts w:ascii="Calibri" w:hAnsi="Calibri" w:eastAsia="Calibri" w:cs="Calibri"/>
+          <w:rFonts w:ascii="Calibri" w:hAnsi="Calibri" w:cs="Calibri"/>
           <w:b/>
-          <w:i w:val="0"/>
           <w:sz w:val="22"/>
+          <w:u w:val="single"/>
         </w:rPr>
         <w:t>PROFESSIONAL SUMMARY</w:t>
       </w:r>
     </w:p>
     <w:p>
       <w:pPr>
-        <w:keepNext w:val="0"/>
-        <w:widowControl/>
         <w:spacing w:before="0" w:after="60" w:line="264" w:lineRule="auto"/>
       </w:pPr>
       <w:r>
         <w:rPr>
-          <w:rFonts w:ascii="Calibri" w:hAnsi="Calibri"/>
+          <w:rFonts w:ascii="Calibri" w:hAnsi="Calibri" w:cs="Calibri"/>
           <w:sz w:val="20"/>
         </w:rPr>
-        <w:t xml:space="preserve">Audio technology specialist, AI audio evaluator and software product developer with formal music-production training and commercial tools for Ableton Live, Max for Live, VST3 and Audio Unit. Experienced in critical listening and comparing AI-processed audio for noise, clipping, distortion, bleed, phase, transient and spectral artefacts, with structured, actionable feedback. Evaluated 60+ neural source-separation and restoration model options; directed Python-to-C++ / MLX optimisation achieving up to ~1.85× median faster local MLX inference versus prior MPS/audio-separator baselines on Apple Silicon (up to ~2.5× on MelBand RoFormer) while preserving reference behaviour. Founder of </w:t>
+        <w:t xml:space="preserve">AI audio evaluator, music-technology product developer and audio-software specialist with formal production training and experience creating commercial tools for Ableton Live, Max for Live, VST3 and Audio Unit. Specialises in critical listening, neural source-separation evaluation, regression testing and cross-platform audio validation. Evaluated more than 60 separation and restoration model options and directed native C++/MLX optimisation work achieving a documented median 1.85× speedup across tested Apple Silicon workloads, reaching 2.5× on MelBand RoFormer while preserving validated output parity. Founder of </w:t>
       </w:r>
       <w:hyperlink r:id="rId11">
         <w:r>
@@ -195,15 +187,15 @@
             <w:rFonts w:ascii="Calibri" w:hAnsi="Calibri" w:cs="Calibri"/>
             <w:sz w:val="20"/>
             <w:szCs w:val="20"/>
-            <w:color w:val="0563C1" w:themeColor="hyperlink"/>
             <w:u w:val="single"/>
+            <w:color w:val="0563C1"/>
           </w:rPr>
           <w:t xml:space="preserve">Ostin Solo</w:t>
         </w:r>
       </w:hyperlink>
       <w:r>
         <w:rPr>
-          <w:rFonts w:ascii="Calibri" w:hAnsi="Calibri"/>
+          <w:rFonts w:ascii="Calibri" w:hAnsi="Calibri" w:cs="Calibri"/>
           <w:sz w:val="20"/>
         </w:rPr>
         <w:t xml:space="preserve"> and </w:t>
@@ -214,47 +206,42 @@
             <w:rFonts w:ascii="Calibri" w:hAnsi="Calibri" w:cs="Calibri"/>
             <w:sz w:val="20"/>
             <w:szCs w:val="20"/>
-            <w:color w:val="0563C1" w:themeColor="hyperlink"/>
             <w:u w:val="single"/>
+            <w:color w:val="0563C1"/>
           </w:rPr>
           <w:t xml:space="preserve">VSTOPIA</w:t>
         </w:r>
       </w:hyperlink>
       <w:r>
         <w:rPr>
-          <w:rFonts w:ascii="Calibri" w:hAnsi="Calibri"/>
+          <w:rFonts w:ascii="Calibri" w:hAnsi="Calibri" w:cs="Calibri"/>
           <w:sz w:val="20"/>
         </w:rPr>
-        <w:t>. Native Italian; full professional English (IELTS); professional working Spanish; based in London with the right to work in the UK.</w:t>
+        <w:t>; native Italian speaker with full professional English proficiency and professional working Spanish.</w:t>
       </w:r>
     </w:p>
     <w:p>
       <w:pPr>
         <w:keepNext/>
-        <w:widowControl/>
         <w:spacing w:before="200" w:after="80" w:line="264" w:lineRule="auto"/>
-        <w:pBdr>
-          <w:bottom w:val="single" w:sz="6" w:space="1" w:color="666666"/>
-        </w:pBdr>
       </w:pPr>
       <w:r>
         <w:rPr>
-          <w:rFonts w:ascii="Calibri" w:hAnsi="Calibri" w:eastAsia="Calibri" w:cs="Calibri"/>
+          <w:rFonts w:ascii="Calibri" w:hAnsi="Calibri" w:cs="Calibri"/>
           <w:b/>
-          <w:i w:val="0"/>
           <w:sz w:val="22"/>
+          <w:u w:val="single"/>
         </w:rPr>
         <w:t>CORE EXPERTISE</w:t>
       </w:r>
     </w:p>
     <w:p>
       <w:pPr>
-        <w:widowControl/>
         <w:spacing w:before="0" w:after="60" w:line="264" w:lineRule="auto"/>
       </w:pPr>
       <w:r>
         <w:rPr>
-          <w:rFonts w:ascii="Calibri" w:hAnsi="Calibri" w:eastAsia="Calibri" w:cs="Calibri"/>
+          <w:rFonts w:ascii="Calibri" w:hAnsi="Calibri" w:cs="Calibri"/>
           <w:b/>
           <w:sz w:val="20"/>
         </w:rPr>
@@ -262,21 +249,20 @@
       </w:r>
       <w:r>
         <w:rPr>
-          <w:rFonts w:ascii="Calibri" w:hAnsi="Calibri" w:eastAsia="Calibri" w:cs="Calibri"/>
+          <w:rFonts w:ascii="Calibri" w:hAnsi="Calibri" w:cs="Calibri"/>
           <w:b w:val="0"/>
           <w:sz w:val="20"/>
         </w:rPr>
-        <w:t>critical listening; clarity and intelligibility; background noise; clipping; distortion; pronunciation; unnatural phrasing; frequency imbalance; phase; transients; source bleed; spectral artefacts; A/B comparison; structured rubrics; batch-consistent feedback.</w:t>
+        <w:t>Critical listening; clarity; intelligibility; background noise; clipping; distortion; pronunciation; phase; transient preservation; source bleed; spectral artefacts; A/B comparison; structured rubrics.</w:t>
       </w:r>
     </w:p>
     <w:p>
       <w:pPr>
-        <w:widowControl/>
         <w:spacing w:before="0" w:after="60" w:line="264" w:lineRule="auto"/>
       </w:pPr>
       <w:r>
         <w:rPr>
-          <w:rFonts w:ascii="Calibri" w:hAnsi="Calibri" w:eastAsia="Calibri" w:cs="Calibri"/>
+          <w:rFonts w:ascii="Calibri" w:hAnsi="Calibri" w:cs="Calibri"/>
           <w:b/>
           <w:sz w:val="20"/>
         </w:rPr>
@@ -284,21 +270,20 @@
       </w:r>
       <w:r>
         <w:rPr>
-          <w:rFonts w:ascii="Calibri" w:hAnsi="Calibri" w:eastAsia="Calibri" w:cs="Calibri"/>
+          <w:rFonts w:ascii="Calibri" w:hAnsi="Calibri" w:cs="Calibri"/>
           <w:b w:val="0"/>
           <w:sz w:val="20"/>
         </w:rPr>
-        <w:t>audio-to-transcript verification; STT validation; accents; contextual errors; unclear segments; timestamps; structured error reporting.</w:t>
+        <w:t>Audio-to-transcript verification; STT validation; accents; contextual errors; unclear segments; timestamps; structured error reporting.</w:t>
       </w:r>
     </w:p>
     <w:p>
       <w:pPr>
-        <w:widowControl/>
         <w:spacing w:before="0" w:after="60" w:line="264" w:lineRule="auto"/>
       </w:pPr>
       <w:r>
         <w:rPr>
-          <w:rFonts w:ascii="Calibri" w:hAnsi="Calibri" w:eastAsia="Calibri" w:cs="Calibri"/>
+          <w:rFonts w:ascii="Calibri" w:hAnsi="Calibri" w:cs="Calibri"/>
           <w:b/>
           <w:sz w:val="20"/>
         </w:rPr>
@@ -306,50 +291,45 @@
       </w:r>
       <w:r>
         <w:rPr>
-          <w:rFonts w:ascii="Calibri" w:hAnsi="Calibri" w:eastAsia="Calibri" w:cs="Calibri"/>
+          <w:rFonts w:ascii="Calibri" w:hAnsi="Calibri" w:cs="Calibri"/>
           <w:b w:val="0"/>
           <w:sz w:val="20"/>
         </w:rPr>
-        <w:t>signal flow; EQ; noise reduction; normalization; recording; editing; mixing; mastering; Ableton Live; Max/MSP; Max for Live; neural source separation; real-time audio.</w:t>
+        <w:t>Signal flow; EQ; noise reduction; normalization; recording; editing; mixing; mastering; Ableton Live; Max/MSP; Max for Live; neural source separation; real-time audio.</w:t>
       </w:r>
     </w:p>
     <w:p>
       <w:pPr>
-        <w:widowControl/>
         <w:spacing w:before="0" w:after="60" w:line="264" w:lineRule="auto"/>
       </w:pPr>
       <w:r>
         <w:rPr>
-          <w:rFonts w:ascii="Calibri" w:hAnsi="Calibri" w:eastAsia="Calibri" w:cs="Calibri"/>
+          <w:rFonts w:ascii="Calibri" w:hAnsi="Calibri" w:cs="Calibri"/>
           <w:b/>
           <w:sz w:val="20"/>
         </w:rPr>
-        <w:t xml:space="preserve">AI Evaluation &amp; Software Systems: </w:t>
+        <w:t xml:space="preserve">AI &amp; Software Systems: </w:t>
       </w:r>
       <w:r>
         <w:rPr>
-          <w:rFonts w:ascii="Calibri" w:hAnsi="Calibri" w:eastAsia="Calibri" w:cs="Calibri"/>
+          <w:rFonts w:ascii="Calibri" w:hAnsi="Calibri" w:cs="Calibri"/>
           <w:b w:val="0"/>
           <w:sz w:val="20"/>
         </w:rPr>
-        <w:t>model comparison; acceptance criteria; regression testing; function calling; local models; MLX; Metal/MPS; GGUF; C++; Python; JavaScript/Node.js; JUCE; Docker; APIs; Heroku; MongoDB; cross-platform macOS (Intel and Apple Silicon) and Windows/CUDA validation.</w:t>
+        <w:t>Model comparison; acceptance criteria; regression testing; function calling; local models; MLX; Metal/MPS; GGUF; C++; Python; JavaScript/Node.js; JUCE; Docker; APIs; cross-platform macOS and Windows/CUDA validation.</w:t>
       </w:r>
     </w:p>
     <w:p>
       <w:pPr>
         <w:keepNext/>
-        <w:widowControl/>
         <w:spacing w:before="200" w:after="80" w:line="264" w:lineRule="auto"/>
-        <w:pBdr>
-          <w:bottom w:val="single" w:sz="6" w:space="1" w:color="666666"/>
-        </w:pBdr>
       </w:pPr>
       <w:r>
         <w:rPr>
-          <w:rFonts w:ascii="Calibri" w:hAnsi="Calibri" w:eastAsia="Calibri" w:cs="Calibri"/>
+          <w:rFonts w:ascii="Calibri" w:hAnsi="Calibri" w:cs="Calibri"/>
           <w:b/>
-          <w:i w:val="0"/>
           <w:sz w:val="22"/>
+          <w:u w:val="single"/>
         </w:rPr>
         <w:t>PROFESSIONAL EXPERIENCE</w:t>
       </w:r>
@@ -357,12 +337,11 @@
     <w:p>
       <w:pPr>
         <w:keepNext/>
-        <w:widowControl/>
         <w:spacing w:before="140" w:after="0" w:line="264" w:lineRule="auto"/>
       </w:pPr>
       <w:r>
         <w:rPr>
-          <w:rFonts w:ascii="Calibri" w:hAnsi="Calibri"/>
+          <w:rFonts w:ascii="Calibri" w:hAnsi="Calibri" w:cs="Calibri"/>
           <w:b/>
           <w:sz w:val="21"/>
         </w:rPr>
@@ -375,9 +354,8 @@
             <w:sz w:val="21"/>
             <w:szCs w:val="21"/>
             <w:b/>
-            <w:bCs/>
-            <w:color w:val="0563C1" w:themeColor="hyperlink"/>
             <w:u w:val="single"/>
+            <w:color w:val="0563C1"/>
           </w:rPr>
           <w:t xml:space="preserve">VSTOPIA</w:t>
         </w:r>
@@ -386,14 +364,12 @@
     <w:p>
       <w:pPr>
         <w:keepNext/>
-        <w:widowControl/>
         <w:spacing w:before="0" w:after="40" w:line="264" w:lineRule="auto"/>
       </w:pPr>
       <w:r>
         <w:rPr>
-          <w:rFonts w:ascii="Calibri" w:hAnsi="Calibri" w:eastAsia="Calibri" w:cs="Calibri"/>
+          <w:rFonts w:ascii="Calibri" w:hAnsi="Calibri" w:cs="Calibri"/>
           <w:b w:val="0"/>
-          <w:i w:val="0"/>
           <w:sz w:val="18"/>
         </w:rPr>
         <w:t>London, United Kingdom | 2023–Present</w:t>
@@ -402,32 +378,24 @@
     <w:p>
       <w:pPr>
         <w:pStyle w:val="ListBullet"/>
-        <w:keepNext w:val="0"/>
-        <w:widowControl/>
         <w:spacing w:before="0" w:after="40" w:line="264" w:lineRule="auto"/>
-        <w:ind w:left="360" w:hanging="216"/>
       </w:pPr>
       <w:r>
         <w:rPr>
-          <w:rFonts w:ascii="Calibri" w:hAnsi="Calibri" w:eastAsia="Calibri" w:cs="Calibri"/>
-          <w:b w:val="0"/>
+          <w:rFonts w:ascii="Calibri" w:hAnsi="Calibri" w:cs="Calibri"/>
           <w:sz w:val="20"/>
         </w:rPr>
-        <w:t>Founded and lead a specialist platform for Max for Live devices, audio plug-ins and independent music-technology developers (developers retain 90% of each sale).</w:t>
+        <w:t>Founded and lead a specialist platform for Max for Live devices, audio plug-ins and independent music-technology developers.</w:t>
       </w:r>
     </w:p>
     <w:p>
       <w:pPr>
         <w:pStyle w:val="ListBullet"/>
-        <w:keepNext w:val="0"/>
-        <w:widowControl/>
         <w:spacing w:before="0" w:after="40" w:line="264" w:lineRule="auto"/>
-        <w:ind w:left="360" w:hanging="216"/>
       </w:pPr>
       <w:r>
         <w:rPr>
-          <w:rFonts w:ascii="Calibri" w:hAnsi="Calibri" w:eastAsia="Calibri" w:cs="Calibri"/>
-          <w:b w:val="0"/>
+          <w:rFonts w:ascii="Calibri" w:hAnsi="Calibri" w:cs="Calibri"/>
           <w:sz w:val="20"/>
         </w:rPr>
         <w:t>Define catalogue standards and acceptance criteria; evaluate products for originality, reliability, usability and professional relevance.</w:t>
@@ -436,46 +404,37 @@
     <w:p>
       <w:pPr>
         <w:pStyle w:val="ListBullet"/>
-        <w:keepNext w:val="0"/>
-        <w:widowControl/>
         <w:spacing w:before="0" w:after="40" w:line="264" w:lineRule="auto"/>
-        <w:ind w:left="360" w:hanging="216"/>
       </w:pPr>
       <w:r>
         <w:rPr>
-          <w:rFonts w:ascii="Calibri" w:hAnsi="Calibri" w:eastAsia="Calibri" w:cs="Calibri"/>
-          <w:b w:val="0"/>
+          <w:rFonts w:ascii="Calibri" w:hAnsi="Calibri" w:cs="Calibri"/>
           <w:sz w:val="20"/>
         </w:rPr>
-        <w:t>Translate concepts into technical specifications; coordinate external developers; oversee testing, documentation, publishing and customer communication.</w:t>
+        <w:t>Translate concepts into specifications, coordinate external developers and oversee testing, documentation, publishing and customer communication.</w:t>
       </w:r>
     </w:p>
     <w:p>
       <w:pPr>
         <w:pStyle w:val="ListBullet"/>
-        <w:keepNext w:val="0"/>
-        <w:widowControl/>
         <w:spacing w:before="0" w:after="40" w:line="264" w:lineRule="auto"/>
-        <w:ind w:left="360" w:hanging="216"/>
       </w:pPr>
       <w:r>
         <w:rPr>
-          <w:rFonts w:ascii="Calibri" w:hAnsi="Calibri" w:eastAsia="Calibri" w:cs="Calibri"/>
-          <w:b w:val="0"/>
+          <w:rFonts w:ascii="Calibri" w:hAnsi="Calibri" w:cs="Calibri"/>
           <w:sz w:val="20"/>
         </w:rPr>
-        <w:t>Operate platform infrastructure including licensing, APIs and Hetzner-hosted Docker services; prototype tools that support Max/MSP and developer workflows.</w:t>
+        <w:t>Operate licensing, API and Hetzner-hosted Docker infrastructure while prototyping tools for Max/MSP and developer workflows.</w:t>
       </w:r>
     </w:p>
     <w:p>
       <w:pPr>
         <w:keepNext/>
-        <w:widowControl/>
         <w:spacing w:before="140" w:after="0" w:line="264" w:lineRule="auto"/>
       </w:pPr>
       <w:r>
         <w:rPr>
-          <w:rFonts w:ascii="Calibri" w:hAnsi="Calibri"/>
+          <w:rFonts w:ascii="Calibri" w:hAnsi="Calibri" w:cs="Calibri"/>
           <w:b/>
           <w:sz w:val="21"/>
         </w:rPr>
@@ -488,9 +447,8 @@
             <w:sz w:val="21"/>
             <w:szCs w:val="21"/>
             <w:b/>
-            <w:bCs/>
-            <w:color w:val="0563C1" w:themeColor="hyperlink"/>
             <w:u w:val="single"/>
+            <w:color w:val="0563C1"/>
           </w:rPr>
           <w:t xml:space="preserve">Ostin Solo</w:t>
         </w:r>
@@ -499,14 +457,12 @@
     <w:p>
       <w:pPr>
         <w:keepNext/>
-        <w:widowControl/>
         <w:spacing w:before="0" w:after="40" w:line="264" w:lineRule="auto"/>
       </w:pPr>
       <w:r>
         <w:rPr>
-          <w:rFonts w:ascii="Calibri" w:hAnsi="Calibri" w:eastAsia="Calibri" w:cs="Calibri"/>
+          <w:rFonts w:ascii="Calibri" w:hAnsi="Calibri" w:cs="Calibri"/>
           <w:b w:val="0"/>
-          <w:i w:val="0"/>
           <w:sz w:val="18"/>
         </w:rPr>
         <w:t>London, United Kingdom | 2018–Present</w:t>
@@ -515,65 +471,51 @@
     <w:p>
       <w:pPr>
         <w:pStyle w:val="ListBullet"/>
-        <w:keepNext w:val="0"/>
-        <w:widowControl/>
         <w:spacing w:before="0" w:after="40" w:line="264" w:lineRule="auto"/>
-        <w:ind w:left="360" w:hanging="216"/>
       </w:pPr>
       <w:r>
         <w:rPr>
-          <w:rFonts w:ascii="Calibri" w:hAnsi="Calibri" w:eastAsia="Calibri" w:cs="Calibri"/>
-          <w:b w:val="0"/>
+          <w:rFonts w:ascii="Calibri" w:hAnsi="Calibri" w:cs="Calibri"/>
           <w:sz w:val="20"/>
         </w:rPr>
-        <w:t>Conceive, specify, prototype, test and direct commercial audio-software products from concept through release for Ableton Live, Max for Live, VST3 and Audio Unit.</w:t>
+        <w:t>Conceive, specify, prototype, test and direct commercial audio-software products for Ableton Live, Max for Live, VST3 and Audio Unit.</w:t>
       </w:r>
     </w:p>
     <w:p>
       <w:pPr>
         <w:pStyle w:val="ListBullet"/>
-        <w:keepNext w:val="0"/>
-        <w:widowControl/>
         <w:spacing w:before="0" w:after="40" w:line="264" w:lineRule="auto"/>
-        <w:ind w:left="360" w:hanging="216"/>
       </w:pPr>
       <w:r>
         <w:rPr>
-          <w:rFonts w:ascii="Calibri" w:hAnsi="Calibri" w:eastAsia="Calibri" w:cs="Calibri"/>
-          <w:b w:val="0"/>
+          <w:rFonts w:ascii="Calibri" w:hAnsi="Calibri" w:cs="Calibri"/>
           <w:sz w:val="20"/>
         </w:rPr>
-        <w:t>Contribute directly to Max/MSP, JavaScript/Node.js, Python and cross-platform prototyping; coordinate specialist collaborators for C++/JUCE and platform-specific components.</w:t>
+        <w:t>Contribute directly to Max/MSP, JavaScript/Node.js, Python and cross-platform prototyping, while coordinating specialist C++/JUCE development.</w:t>
       </w:r>
     </w:p>
     <w:p>
       <w:pPr>
         <w:pStyle w:val="ListBullet"/>
-        <w:keepNext w:val="0"/>
-        <w:widowControl/>
         <w:spacing w:before="0" w:after="40" w:line="264" w:lineRule="auto"/>
-        <w:ind w:left="360" w:hanging="216"/>
       </w:pPr>
       <w:r>
         <w:rPr>
-          <w:rFonts w:ascii="Calibri" w:hAnsi="Calibri" w:eastAsia="Calibri" w:cs="Calibri"/>
-          <w:b w:val="0"/>
+          <w:rFonts w:ascii="Calibri" w:hAnsi="Calibri" w:cs="Calibri"/>
           <w:sz w:val="20"/>
         </w:rPr>
-        <w:t>Perform critical listening, cross-platform validation, defect diagnosis, regression testing and release-quality review across macOS (Intel and Apple Silicon) and Windows.</w:t>
+        <w:t>Perform critical listening, model comparison, defect diagnosis, regression testing and release-quality validation across macOS and Windows.</w:t>
       </w:r>
     </w:p>
     <w:p>
       <w:pPr>
         <w:pStyle w:val="ListBullet"/>
-        <w:keepNext w:val="0"/>
-        <w:widowControl/>
         <w:spacing w:before="0" w:after="40" w:line="264" w:lineRule="auto"/>
-        <w:ind w:left="360" w:hanging="216"/>
       </w:pPr>
       <w:r>
         <w:rPr>
-          <w:rFonts w:ascii="Calibri" w:hAnsi="Calibri"/>
+          <w:rFonts w:ascii="Calibri" w:hAnsi="Calibri" w:cs="Calibri"/>
+          <w:b w:val="0"/>
           <w:sz w:val="20"/>
         </w:rPr>
         <w:t xml:space="preserve">Commercial portfolio includes </w:t>
@@ -584,15 +526,16 @@
             <w:rFonts w:ascii="Calibri" w:hAnsi="Calibri" w:cs="Calibri"/>
             <w:sz w:val="20"/>
             <w:szCs w:val="20"/>
-            <w:color w:val="0563C1" w:themeColor="hyperlink"/>
             <w:u w:val="single"/>
+            <w:color w:val="0563C1"/>
           </w:rPr>
-          <w:t xml:space="preserve">Dynamic Split Module / Doctor Sample Unit</w:t>
+          <w:t xml:space="preserve">Dynamic Split Module</w:t>
         </w:r>
       </w:hyperlink>
       <w:r>
         <w:rPr>
-          <w:rFonts w:ascii="Calibri" w:hAnsi="Calibri"/>
+          <w:rFonts w:ascii="Calibri" w:hAnsi="Calibri" w:cs="Calibri"/>
+          <w:b w:val="0"/>
           <w:sz w:val="20"/>
         </w:rPr>
         <w:t xml:space="preserve">, MagicTrackpad-MPE, OpenMultitouch Externals, ASA Tin, Clip Wizard II, </w:t>
@@ -603,34 +546,33 @@
             <w:rFonts w:ascii="Calibri" w:hAnsi="Calibri" w:cs="Calibri"/>
             <w:sz w:val="20"/>
             <w:szCs w:val="20"/>
-            <w:color w:val="0563C1" w:themeColor="hyperlink"/>
             <w:u w:val="single"/>
+            <w:color w:val="0563C1"/>
           </w:rPr>
           <w:t xml:space="preserve">Preview Tuner</w:t>
         </w:r>
       </w:hyperlink>
       <w:r>
         <w:rPr>
-          <w:rFonts w:ascii="Calibri" w:hAnsi="Calibri"/>
+          <w:rFonts w:ascii="Calibri" w:hAnsi="Calibri" w:cs="Calibri"/>
+          <w:b w:val="0"/>
           <w:sz w:val="20"/>
         </w:rPr>
-        <w:t xml:space="preserve">, Pendolo, Ableton Drive, Device Window, Simpler+ and Split Wizard+.</w:t>
+        <w:t>, Pendolo, Ableton Drive, Device Window, Simpler+ and Split Wizard+.</w:t>
       </w:r>
     </w:p>
     <w:p>
       <w:pPr>
         <w:pStyle w:val="ListBullet"/>
-        <w:keepNext w:val="0"/>
-        <w:widowControl/>
         <w:spacing w:before="0" w:after="40" w:line="264" w:lineRule="auto"/>
-        <w:ind w:left="360" w:hanging="216"/>
       </w:pPr>
       <w:r>
         <w:rPr>
-          <w:rFonts w:ascii="Calibri" w:hAnsi="Calibri"/>
+          <w:rFonts w:ascii="Calibri" w:hAnsi="Calibri" w:cs="Calibri"/>
+          <w:b w:val="0"/>
           <w:sz w:val="20"/>
         </w:rPr>
-        <w:t xml:space="preserve">Collaborated with Grammy-winning producer Connor McDonough on </w:t>
+        <w:t xml:space="preserve">Collaborated with Grammy-winning, multi-award-winning producer Connor McDonough on </w:t>
       </w:r>
       <w:hyperlink r:id="rId17">
         <w:r>
@@ -638,31 +580,30 @@
             <w:rFonts w:ascii="Calibri" w:hAnsi="Calibri" w:cs="Calibri"/>
             <w:sz w:val="20"/>
             <w:szCs w:val="20"/>
-            <w:color w:val="0563C1" w:themeColor="hyperlink"/>
             <w:u w:val="single"/>
+            <w:color w:val="0563C1"/>
           </w:rPr>
           <w:t xml:space="preserve">Preview Tuner</w:t>
         </w:r>
       </w:hyperlink>
       <w:r>
         <w:rPr>
-          <w:rFonts w:ascii="Calibri" w:hAnsi="Calibri"/>
+          <w:rFonts w:ascii="Calibri" w:hAnsi="Calibri" w:cs="Calibri"/>
+          <w:b w:val="0"/>
           <w:sz w:val="20"/>
         </w:rPr>
-        <w:t xml:space="preserve">, a Max for Live tuning/preview workflow tool.</w:t>
+        <w:t>, developing a Max for Live tuning and sample-preview workflow tool based on his production requirements.</w:t>
       </w:r>
     </w:p>
     <w:p>
       <w:pPr>
         <w:keepNext/>
-        <w:widowControl/>
         <w:spacing w:before="140" w:after="0" w:line="264" w:lineRule="auto"/>
       </w:pPr>
       <w:r>
         <w:rPr>
-          <w:rFonts w:ascii="Calibri" w:hAnsi="Calibri" w:eastAsia="Calibri" w:cs="Calibri"/>
+          <w:rFonts w:ascii="Calibri" w:hAnsi="Calibri" w:cs="Calibri"/>
           <w:b/>
-          <w:i w:val="0"/>
           <w:sz w:val="21"/>
         </w:rPr>
         <w:t>Founder, Artistic Director &amp; Experience Designer — Macrowave / Cacao Discoteca / Basement</w:t>
@@ -671,14 +612,12 @@
     <w:p>
       <w:pPr>
         <w:keepNext/>
-        <w:widowControl/>
         <w:spacing w:before="0" w:after="40" w:line="264" w:lineRule="auto"/>
       </w:pPr>
       <w:r>
         <w:rPr>
-          <w:rFonts w:ascii="Calibri" w:hAnsi="Calibri" w:eastAsia="Calibri" w:cs="Calibri"/>
+          <w:rFonts w:ascii="Calibri" w:hAnsi="Calibri" w:cs="Calibri"/>
           <w:b w:val="0"/>
-          <w:i w:val="0"/>
           <w:sz w:val="18"/>
         </w:rPr>
         <w:t>Avellino and Montemiletto, Italy | 2014–2016</w:t>
@@ -687,173 +626,53 @@
     <w:p>
       <w:pPr>
         <w:pStyle w:val="ListBullet"/>
-        <w:keepNext w:val="0"/>
-        <w:widowControl/>
         <w:spacing w:before="0" w:after="40" w:line="264" w:lineRule="auto"/>
-        <w:ind w:left="360" w:hanging="216"/>
       </w:pPr>
       <w:r>
         <w:rPr>
-          <w:rFonts w:ascii="Calibri" w:hAnsi="Calibri" w:eastAsia="Calibri" w:cs="Calibri"/>
-          <w:b w:val="0"/>
+          <w:rFonts w:ascii="Calibri" w:hAnsi="Calibri" w:cs="Calibri"/>
           <w:sz w:val="20"/>
         </w:rPr>
-        <w:t>Directed multidisciplinary electronic-music and multimedia programmes attracting audiences of up to 3,000, including extended events lasting up to 24 hours.</w:t>
+        <w:t>Directed multidisciplinary electronic-music and multimedia programmes attracting audiences of up to 3,000, including events lasting up to 24 hours.</w:t>
       </w:r>
     </w:p>
     <w:p>
       <w:pPr>
         <w:pStyle w:val="ListBullet"/>
-        <w:keepNext w:val="0"/>
-        <w:widowControl/>
         <w:spacing w:before="0" w:after="40" w:line="264" w:lineRule="auto"/>
-        <w:ind w:left="360" w:hanging="216"/>
       </w:pPr>
       <w:r>
         <w:rPr>
-          <w:rFonts w:ascii="Calibri" w:hAnsi="Calibri" w:eastAsia="Calibri" w:cs="Calibri"/>
-          <w:b w:val="0"/>
+          <w:rFonts w:ascii="Calibri" w:hAnsi="Calibri" w:cs="Calibri"/>
           <w:sz w:val="20"/>
         </w:rPr>
-        <w:t>Curated performers and coordinated artists, venue teams, technicians and suppliers; contributed to scenography, projection mapping and interactive installations.</w:t>
+        <w:t>Curated performers and coordinated artists, venue teams, technicians and suppliers.</w:t>
+      </w:r>
+    </w:p>
+    <w:p>
+      <w:pPr>
+        <w:pStyle w:val="ListBullet"/>
+        <w:spacing w:before="0" w:after="40" w:line="264" w:lineRule="auto"/>
+      </w:pPr>
+      <w:r>
+        <w:rPr>
+          <w:rFonts w:ascii="Calibri" w:hAnsi="Calibri" w:cs="Calibri"/>
+          <w:sz w:val="20"/>
+        </w:rPr>
+        <w:t>Contributed to scenography, projection mapping, interactive installations, interior design and venue identity.</w:t>
       </w:r>
     </w:p>
     <w:p>
       <w:pPr>
         <w:keepNext/>
-        <w:widowControl/>
         <w:spacing w:before="200" w:after="80" w:line="264" w:lineRule="auto"/>
-        <w:pBdr>
-          <w:bottom w:val="single" w:sz="6" w:space="1" w:color="666666"/>
-        </w:pBdr>
       </w:pPr>
       <w:r>
         <w:rPr>
-          <w:rFonts w:ascii="Calibri" w:hAnsi="Calibri" w:eastAsia="Calibri" w:cs="Calibri"/>
+          <w:rFonts w:ascii="Calibri" w:hAnsi="Calibri" w:cs="Calibri"/>
           <w:b/>
-          <w:i w:val="0"/>
           <w:sz w:val="22"/>
-        </w:rPr>
-        <w:t>AUDIO QUALITY EVALUATION &amp; AI REVIEW</w:t>
-      </w:r>
-    </w:p>
-    <w:p>
-      <w:pPr>
-        <w:pStyle w:val="ListBullet"/>
-        <w:keepNext w:val="0"/>
-        <w:widowControl/>
-        <w:spacing w:before="0" w:after="40" w:line="264" w:lineRule="auto"/>
-        <w:ind w:left="360" w:hanging="216"/>
-      </w:pPr>
-      <w:r>
-        <w:rPr>
-          <w:rFonts w:ascii="Calibri" w:hAnsi="Calibri" w:eastAsia="Calibri" w:cs="Calibri"/>
-          <w:b w:val="0"/>
-          <w:sz w:val="20"/>
-        </w:rPr>
-        <w:t>Compare recordings and AI-processed outputs for clarity, intelligibility, naturalness, background noise, clipping, distortion, frequency imbalance, phase integrity, transient preservation and source bleed.</w:t>
-      </w:r>
-    </w:p>
-    <w:p>
-      <w:pPr>
-        <w:pStyle w:val="ListBullet"/>
-        <w:keepNext w:val="0"/>
-        <w:widowControl/>
-        <w:spacing w:before="0" w:after="40" w:line="264" w:lineRule="auto"/>
-        <w:ind w:left="360" w:hanging="216"/>
-      </w:pPr>
-      <w:r>
-        <w:rPr>
-          <w:rFonts w:ascii="Calibri" w:hAnsi="Calibri" w:eastAsia="Calibri" w:cs="Calibri"/>
-          <w:b w:val="0"/>
-          <w:sz w:val="20"/>
-        </w:rPr>
-        <w:t>Evaluate speech-recognition and transcription outputs against source audio; identify mismatches, unclear segments, pronunciation issues and contextual errors.</w:t>
-      </w:r>
-    </w:p>
-    <w:p>
-      <w:pPr>
-        <w:pStyle w:val="ListBullet"/>
-        <w:keepNext w:val="0"/>
-        <w:widowControl/>
-        <w:spacing w:before="0" w:after="40" w:line="264" w:lineRule="auto"/>
-        <w:ind w:left="360" w:hanging="216"/>
-      </w:pPr>
-      <w:r>
-        <w:rPr>
-          <w:rFonts w:ascii="Calibri" w:hAnsi="Calibri" w:eastAsia="Calibri" w:cs="Calibri"/>
-          <w:b w:val="0"/>
-          <w:sz w:val="20"/>
-        </w:rPr>
-        <w:t>Apply repeatable evaluation criteria consistently across batches and provide concise, evidence-based corrective feedback aligned with structured rubrics.</w:t>
-      </w:r>
-    </w:p>
-    <w:p>
-      <w:pPr>
-        <w:pStyle w:val="ListBullet"/>
-        <w:keepNext w:val="0"/>
-        <w:widowControl/>
-        <w:spacing w:before="0" w:after="40" w:line="264" w:lineRule="auto"/>
-        <w:ind w:left="360" w:hanging="216"/>
-      </w:pPr>
-      <w:r>
-        <w:rPr>
-          <w:rFonts w:ascii="Calibri" w:hAnsi="Calibri" w:eastAsia="Calibri" w:cs="Calibri"/>
-          <w:b w:val="0"/>
-          <w:sz w:val="20"/>
-        </w:rPr>
-        <w:t>Conduct A/B comparisons between audio-processing and source-separation models, documenting strengths, artefacts, failure cases and hardware-performance differences.</w:t>
-      </w:r>
-    </w:p>
-    <w:p>
-      <w:pPr>
-        <w:pStyle w:val="ListBullet"/>
-        <w:keepNext w:val="0"/>
-        <w:widowControl/>
-        <w:spacing w:before="0" w:after="40" w:line="264" w:lineRule="auto"/>
-        <w:ind w:left="360" w:hanging="216"/>
-      </w:pPr>
-      <w:r>
-        <w:rPr>
-          <w:rFonts w:ascii="Calibri" w:hAnsi="Calibri" w:eastAsia="Calibri" w:cs="Calibri"/>
-          <w:b w:val="0"/>
-          <w:sz w:val="20"/>
-        </w:rPr>
-        <w:t>Create regression tests and validated reference outputs to confirm that software migrations and optimisations preserve intended audio behaviour.</w:t>
-      </w:r>
-    </w:p>
-    <w:p>
-      <w:pPr>
-        <w:pStyle w:val="ListBullet"/>
-        <w:keepNext w:val="0"/>
-        <w:widowControl/>
-        <w:spacing w:before="0" w:after="40" w:line="264" w:lineRule="auto"/>
-        <w:ind w:left="360" w:hanging="216"/>
-      </w:pPr>
-      <w:r>
-        <w:rPr>
-          <w:rFonts w:ascii="Calibri" w:hAnsi="Calibri" w:eastAsia="Calibri" w:cs="Calibri"/>
-          <w:b w:val="0"/>
-          <w:sz w:val="20"/>
-        </w:rPr>
-        <w:t>Evaluate AI-generated code, technical explanations and implementation plans for correctness, completeness and compliance with requirements.</w:t>
-      </w:r>
-    </w:p>
-    <w:p>
-      <w:pPr>
-        <w:keepNext/>
-        <w:widowControl/>
-        <w:spacing w:before="200" w:after="80" w:line="264" w:lineRule="auto"/>
-        <w:pBdr>
-          <w:bottom w:val="single" w:sz="6" w:space="1" w:color="666666"/>
-        </w:pBdr>
-      </w:pPr>
-      <w:r>
-        <w:rPr>
-          <w:rFonts w:ascii="Calibri" w:hAnsi="Calibri" w:eastAsia="Calibri" w:cs="Calibri"/>
-          <w:b/>
-          <w:i w:val="0"/>
-          <w:sz w:val="22"/>
+          <w:u w:val="single"/>
         </w:rPr>
         <w:t>SELECTED SOFTWARE &amp; AI PROJECTS</w:t>
       </w:r>
@@ -861,7 +680,6 @@
     <w:p>
       <w:pPr>
         <w:keepNext/>
-        <w:widowControl/>
         <w:spacing w:before="100" w:after="20" w:line="264" w:lineRule="auto"/>
       </w:pPr>
       <w:hyperlink r:id="rId13">
@@ -871,100 +689,67 @@
             <w:sz w:val="20"/>
             <w:szCs w:val="20"/>
             <w:b/>
-            <w:bCs/>
-            <w:color w:val="0563C1" w:themeColor="hyperlink"/>
             <w:u w:val="single"/>
+            <w:color w:val="0563C1"/>
           </w:rPr>
-          <w:t xml:space="preserve">Dynamic Split Module / Doctor Sample Unit</w:t>
+          <w:t xml:space="preserve">Dynamic Split Module</w:t>
         </w:r>
       </w:hyperlink>
     </w:p>
     <w:p>
       <w:pPr>
-        <w:keepNext/>
-        <w:widowControl/>
         <w:spacing w:before="0" w:after="40" w:line="264" w:lineRule="auto"/>
       </w:pPr>
       <w:r>
         <w:rPr>
-          <w:rFonts w:ascii="Calibri" w:hAnsi="Calibri" w:eastAsia="Calibri" w:cs="Calibri"/>
-          <w:b w:val="0"/>
-          <w:i/>
+          <w:rFonts w:ascii="Calibri" w:hAnsi="Calibri" w:cs="Calibri"/>
           <w:sz w:val="20"/>
         </w:rPr>
-        <w:t>Commercial audio-separation and restoration systems integrating 60+ neural model options with configurable multi-stage workflows and frozen shared runtimes (Demucs, BS-RoFormer, AudioSep and related backends on MPS/CUDA/CPU).</w:t>
+        <w:t>Commercial Max for Live separation and restoration product covering more than 60 neural model options and configurable multi-stage workflows across MPS, CUDA and CPU.</w:t>
       </w:r>
     </w:p>
     <w:p>
       <w:pPr>
         <w:pStyle w:val="ListBullet"/>
-        <w:keepNext w:val="0"/>
-        <w:widowControl/>
         <w:spacing w:before="0" w:after="40" w:line="264" w:lineRule="auto"/>
-        <w:ind w:left="360" w:hanging="216"/>
       </w:pPr>
       <w:r>
         <w:rPr>
-          <w:rFonts w:ascii="Calibri" w:hAnsi="Calibri" w:eastAsia="Calibri" w:cs="Calibri"/>
-          <w:b w:val="0"/>
+          <w:rFonts w:ascii="Calibri" w:hAnsi="Calibri" w:cs="Calibri"/>
           <w:sz w:val="20"/>
         </w:rPr>
-        <w:t>Evaluate outputs for bleed, transient loss, phase integrity, spectral artefacts, restoration quality, processing speed and hardware compatibility.</w:t>
+        <w:t>Evaluated outputs for bleed, transient loss, phase integrity, spectral artefacts, restoration quality, speed and hardware compatibility.</w:t>
       </w:r>
     </w:p>
     <w:p>
       <w:pPr>
         <w:pStyle w:val="ListBullet"/>
-        <w:keepNext w:val="0"/>
-        <w:widowControl/>
         <w:spacing w:before="0" w:after="40" w:line="264" w:lineRule="auto"/>
-        <w:ind w:left="360" w:hanging="216"/>
       </w:pPr>
       <w:r>
         <w:rPr>
-          <w:rFonts w:ascii="Calibri" w:hAnsi="Calibri" w:eastAsia="Calibri" w:cs="Calibri"/>
-          <w:b w:val="0"/>
+          <w:rFonts w:ascii="Calibri" w:hAnsi="Calibri" w:cs="Calibri"/>
           <w:sz w:val="20"/>
         </w:rPr>
-        <w:t>Direct optimisation and migration of performance-critical paths toward C++ / MLX while preserving validated reference behaviour; MLX-optimised local inference up to ~1.85× median faster than prior audio-separator/MPS baselines on Apple Silicon (up to ~2.5× on MelBand RoFormer); native MLX C++ path bit-exact to Python MLX with RTF ≈ 0.36 (~2.8× realtime) on M4 Pro for 6-stem BS-RoFormer.</w:t>
+        <w:t>Directed C++/MLX optimisation achieving a median 1.85× speedup across tested Apple Silicon workloads and up to 2.5× on MelBand RoFormer, while preserving validated reference behaviour.</w:t>
+      </w:r>
+    </w:p>
+    <w:p>
+      <w:pPr>
+        <w:pStyle w:val="ListBullet"/>
+        <w:spacing w:before="0" w:after="40" w:line="264" w:lineRule="auto"/>
+      </w:pPr>
+      <w:r>
+        <w:rPr>
+          <w:rFonts w:ascii="Calibri" w:hAnsi="Calibri" w:cs="Calibri"/>
+          <w:sz w:val="20"/>
+        </w:rPr>
+        <w:t>Native MLX C++ inference maintained bit-exact parity with Python MLX and achieved RTF ≈ 0.36, approximately 2.8× real time, for six-stem BS-RoFormer on an M4 Pro.</w:t>
       </w:r>
     </w:p>
     <w:p>
       <w:pPr>
         <w:keepNext/>
-        <w:widowControl/>
-        <w:spacing w:before="100" w:after="20" w:line="264" w:lineRule="auto"/>
-      </w:pPr>
-      <w:r>
-        <w:rPr>
-          <w:rFonts w:ascii="Calibri" w:hAnsi="Calibri" w:eastAsia="Calibri" w:cs="Calibri"/>
-          <w:b/>
-          <w:i w:val="0"/>
-          <w:sz w:val="20"/>
-        </w:rPr>
-        <w:t>Roformer MLX C++ / GGUF Local Inference</w:t>
-      </w:r>
-    </w:p>
-    <w:p>
-      <w:pPr>
-        <w:keepNext/>
-        <w:widowControl/>
-        <w:spacing w:before="0" w:after="40" w:line="264" w:lineRule="auto"/>
-      </w:pPr>
-      <w:r>
-        <w:rPr>
-          <w:rFonts w:ascii="Calibri" w:hAnsi="Calibri" w:eastAsia="Calibri" w:cs="Calibri"/>
-          <w:b w:val="0"/>
-          <w:i/>
-          <w:sz w:val="20"/>
-        </w:rPr>
-        <w:t>Native Python-free BS-RoFormer inference research comparing MLX/Metal C++ and GGUF/GGML reference pipelines for parity, deployability and local speed; C++ MLX path maintains bit-exact parity with Python MLX (RTF ≈ 0.36, ~2.8× realtime on M4 Pro for 6-stem BS-RoFormer).</w:t>
-      </w:r>
-    </w:p>
-    <w:p>
-      <w:pPr>
-        <w:keepNext/>
-        <w:widowControl/>
         <w:spacing w:before="100" w:after="20" w:line="264" w:lineRule="auto"/>
       </w:pPr>
       <w:hyperlink r:id="rId15">
@@ -974,9 +759,8 @@
             <w:sz w:val="20"/>
             <w:szCs w:val="20"/>
             <w:b/>
-            <w:bCs/>
-            <w:color w:val="0563C1" w:themeColor="hyperlink"/>
             <w:u w:val="single"/>
+            <w:color w:val="0563C1"/>
           </w:rPr>
           <w:t xml:space="preserve">Max/MSP Audio Streaming &amp; Voice Recognition</w:t>
         </w:r>
@@ -984,31 +768,39 @@
     </w:p>
     <w:p>
       <w:pPr>
-        <w:keepNext/>
-        <w:widowControl/>
+        <w:pStyle w:val="ListBullet"/>
         <w:spacing w:before="0" w:after="40" w:line="264" w:lineRule="auto"/>
       </w:pPr>
       <w:r>
         <w:rPr>
-          <w:rFonts w:ascii="Calibri" w:hAnsi="Calibri" w:eastAsia="Calibri" w:cs="Calibri"/>
-          <w:b w:val="0"/>
-          <w:i/>
+          <w:rFonts w:ascii="Calibri" w:hAnsi="Calibri" w:cs="Calibri"/>
           <w:sz w:val="20"/>
         </w:rPr>
-        <w:t>Real-time system transmitting audio from Max/MSP or Ableton Live to Node.js over UDP/TCP for speech-recognition processing (capture, float32 transport, buffering, sample-rate conversion, recognition path).</w:t>
+        <w:t>Real-time Max/MSP or Ableton Live to Node.js audio transport over UDP/TCP.</w:t>
+      </w:r>
+    </w:p>
+    <w:p>
+      <w:pPr>
+        <w:pStyle w:val="ListBullet"/>
+        <w:spacing w:before="0" w:after="40" w:line="264" w:lineRule="auto"/>
+      </w:pPr>
+      <w:r>
+        <w:rPr>
+          <w:rFonts w:ascii="Calibri" w:hAnsi="Calibri" w:cs="Calibri"/>
+          <w:sz w:val="20"/>
+        </w:rPr>
+        <w:t>Implemented float32 transport, buffering, sample-rate conversion and speech-recognition processing.</w:t>
       </w:r>
     </w:p>
     <w:p>
       <w:pPr>
         <w:keepNext/>
-        <w:widowControl/>
         <w:spacing w:before="100" w:after="20" w:line="264" w:lineRule="auto"/>
       </w:pPr>
       <w:r>
         <w:rPr>
-          <w:rFonts w:ascii="Calibri" w:hAnsi="Calibri" w:eastAsia="Calibri" w:cs="Calibri"/>
+          <w:rFonts w:ascii="Calibri" w:hAnsi="Calibri" w:cs="Calibri"/>
           <w:b/>
-          <w:i w:val="0"/>
           <w:sz w:val="20"/>
         </w:rPr>
         <w:t>Local Voice &amp; Tool-Orchestration System (Work in Progress)</w:t>
@@ -1016,24 +808,32 @@
     </w:p>
     <w:p>
       <w:pPr>
-        <w:keepNext/>
-        <w:widowControl/>
         <w:spacing w:before="0" w:after="40" w:line="264" w:lineRule="auto"/>
       </w:pPr>
       <w:r>
         <w:rPr>
-          <w:rFonts w:ascii="Calibri" w:hAnsi="Calibri" w:eastAsia="Calibri" w:cs="Calibri"/>
-          <w:b w:val="0"/>
-          <w:i/>
+          <w:rFonts w:ascii="Calibri" w:hAnsi="Calibri" w:cs="Calibri"/>
           <w:sz w:val="20"/>
         </w:rPr>
-        <w:t>Local assistant translating spoken instructions into structured operations across Ableton Live and development tools; evaluates low-latency STT and function-calling models with automated speech-to-command validation.</w:t>
+        <w:t>Local assistant (Jarvis-style local orchestration system) translating spoken instructions into structured operations across Ableton Live and development tools.</w:t>
+      </w:r>
+    </w:p>
+    <w:p>
+      <w:pPr>
+        <w:pStyle w:val="ListBullet"/>
+        <w:spacing w:before="0" w:after="40" w:line="264" w:lineRule="auto"/>
+      </w:pPr>
+      <w:r>
+        <w:rPr>
+          <w:rFonts w:ascii="Calibri" w:hAnsi="Calibri" w:cs="Calibri"/>
+          <w:sz w:val="20"/>
+        </w:rPr>
+        <w:t>Uses low-latency STT including Moonshine with contextual correction; evaluates FunctionGemma and compact function-calling models; supports sequential and parallel tool execution with automated speech-to-command validation.</w:t>
       </w:r>
     </w:p>
     <w:p>
       <w:pPr>
         <w:keepNext/>
-        <w:widowControl/>
         <w:spacing w:before="100" w:after="20" w:line="264" w:lineRule="auto"/>
       </w:pPr>
       <w:hyperlink r:id="rId16">
@@ -1043,9 +843,8 @@
             <w:sz w:val="20"/>
             <w:szCs w:val="20"/>
             <w:b/>
-            <w:bCs/>
-            <w:color w:val="0563C1" w:themeColor="hyperlink"/>
             <w:u w:val="single"/>
+            <w:color w:val="0563C1"/>
           </w:rPr>
           <w:t xml:space="preserve">AUDIOENCE</w:t>
         </w:r>
@@ -1053,314 +852,146 @@
     </w:p>
     <w:p>
       <w:pPr>
-        <w:keepNext/>
-        <w:widowControl/>
         <w:spacing w:before="0" w:after="40" w:line="264" w:lineRule="auto"/>
       </w:pPr>
       <w:r>
         <w:rPr>
-          <w:rFonts w:ascii="Calibri" w:hAnsi="Calibri" w:eastAsia="Calibri" w:cs="Calibri"/>
-          <w:b w:val="0"/>
-          <w:i/>
+          <w:rFonts w:ascii="Calibri" w:hAnsi="Calibri" w:cs="Calibri"/>
           <w:sz w:val="20"/>
         </w:rPr>
-        <w:t>Product direction for a real-time remote-collaboration plug-in supporting audio, MIDI and synchronised musical interaction (WebRTC, Ableton Link, buffering and real-time constraints); supporting API/platform uses Heroku and MongoDB.</w:t>
+        <w:t>Product direction for a real-time remote-collaboration VST3/AU plug-in supporting audio, MIDI and synchronised musical interaction via WebRTC, Ableton Link, buffering and synchronisation.</w:t>
       </w:r>
     </w:p>
     <w:p>
       <w:pPr>
         <w:keepNext/>
-        <w:widowControl/>
         <w:spacing w:before="200" w:after="80" w:line="264" w:lineRule="auto"/>
-        <w:pBdr>
-          <w:bottom w:val="single" w:sz="6" w:space="1" w:color="666666"/>
-        </w:pBdr>
       </w:pPr>
       <w:r>
         <w:rPr>
-          <w:rFonts w:ascii="Calibri" w:hAnsi="Calibri" w:eastAsia="Calibri" w:cs="Calibri"/>
+          <w:rFonts w:ascii="Calibri" w:hAnsi="Calibri" w:cs="Calibri"/>
           <w:b/>
-          <w:i w:val="0"/>
           <w:sz w:val="22"/>
+          <w:u w:val="single"/>
         </w:rPr>
         <w:t>EDUCATION</w:t>
       </w:r>
     </w:p>
     <w:p>
       <w:pPr>
-        <w:keepNext/>
-        <w:widowControl/>
-        <w:spacing w:before="60" w:after="20" w:line="264" w:lineRule="auto"/>
+        <w:spacing w:before="0" w:after="40" w:line="264" w:lineRule="auto"/>
       </w:pPr>
       <w:r>
         <w:rPr>
-          <w:rFonts w:ascii="Calibri" w:hAnsi="Calibri" w:eastAsia="Calibri" w:cs="Calibri"/>
-          <w:b/>
+          <w:rFonts w:ascii="Calibri" w:hAnsi="Calibri" w:cs="Calibri"/>
           <w:sz w:val="20"/>
         </w:rPr>
-        <w:t>Music Production — SAE Institute</w:t>
-      </w:r>
-      <w:r>
-        <w:rPr>
-          <w:rFonts w:ascii="Calibri" w:hAnsi="Calibri" w:eastAsia="Calibri" w:cs="Calibri"/>
-          <w:b w:val="0"/>
-          <w:sz w:val="20"/>
-        </w:rPr>
-        <w:t xml:space="preserve"> — 2019–2020</w:t>
+        <w:t>Music Production — SAE Institute | 2019–2020 — Professional music production, recording, editing, mixing, mastering, sound design and synthesis.</w:t>
       </w:r>
     </w:p>
     <w:p>
       <w:pPr>
-        <w:keepNext w:val="0"/>
-        <w:widowControl/>
-        <w:spacing w:before="0" w:after="60" w:line="264" w:lineRule="auto"/>
+        <w:spacing w:before="0" w:after="40" w:line="264" w:lineRule="auto"/>
       </w:pPr>
       <w:r>
         <w:rPr>
-          <w:rFonts w:ascii="Calibri" w:hAnsi="Calibri" w:eastAsia="Calibri" w:cs="Calibri"/>
-          <w:b w:val="0"/>
-          <w:i w:val="0"/>
+          <w:rFonts w:ascii="Calibri" w:hAnsi="Calibri" w:cs="Calibri"/>
           <w:sz w:val="20"/>
         </w:rPr>
-        <w:t>Professional music production, recording, editing, mixing, mastering, sound design and synthesis; Unity/C# interactive-audio work.</w:t>
+        <w:t>Spanish Language Studies — Valencia, Spain | 2022 — Formal study and linguistic immersion.</w:t>
+      </w:r>
+    </w:p>
+    <w:p>
+      <w:pPr>
+        <w:spacing w:before="0" w:after="40" w:line="264" w:lineRule="auto"/>
+      </w:pPr>
+      <w:r>
+        <w:rPr>
+          <w:rFonts w:ascii="Calibri" w:hAnsi="Calibri" w:cs="Calibri"/>
+          <w:sz w:val="20"/>
+        </w:rPr>
+        <w:t>Electronic Music &amp; Musicianship — Italian Conservatory | c. 2004–2009 — Theory, solfeggio, harmony, analysis, electronic music and synthesis.</w:t>
+      </w:r>
+    </w:p>
+    <w:p>
+      <w:pPr>
+        <w:spacing w:before="0" w:after="40" w:line="264" w:lineRule="auto"/>
+      </w:pPr>
+      <w:r>
+        <w:rPr>
+          <w:rFonts w:ascii="Calibri" w:hAnsi="Calibri" w:cs="Calibri"/>
+          <w:sz w:val="20"/>
+        </w:rPr>
+        <w:t>Scientific High School Diploma — Liceo Scientifico | Italy | c. 2007–2012 — Mathematics, physics, natural sciences and humanities.</w:t>
       </w:r>
     </w:p>
     <w:p>
       <w:pPr>
         <w:keepNext/>
-        <w:widowControl/>
-        <w:spacing w:before="60" w:after="20" w:line="264" w:lineRule="auto"/>
+        <w:spacing w:before="200" w:after="80" w:line="264" w:lineRule="auto"/>
       </w:pPr>
       <w:r>
         <w:rPr>
-          <w:rFonts w:ascii="Calibri" w:hAnsi="Calibri" w:eastAsia="Calibri" w:cs="Calibri"/>
+          <w:rFonts w:ascii="Calibri" w:hAnsi="Calibri" w:cs="Calibri"/>
           <w:b/>
-          <w:sz w:val="20"/>
-        </w:rPr>
-        <w:t>Spanish Language Studies — Valencia, Spain</w:t>
-      </w:r>
-      <w:r>
-        <w:rPr>
-          <w:rFonts w:ascii="Calibri" w:hAnsi="Calibri" w:eastAsia="Calibri" w:cs="Calibri"/>
-          <w:b w:val="0"/>
-          <w:sz w:val="20"/>
-        </w:rPr>
-        <w:t xml:space="preserve"> — 2022</w:t>
-      </w:r>
-    </w:p>
-    <w:p>
-      <w:pPr>
-        <w:keepNext w:val="0"/>
-        <w:widowControl/>
-        <w:spacing w:before="0" w:after="60" w:line="264" w:lineRule="auto"/>
-      </w:pPr>
-      <w:r>
-        <w:rPr>
-          <w:rFonts w:ascii="Calibri" w:hAnsi="Calibri" w:eastAsia="Calibri" w:cs="Calibri"/>
-          <w:b w:val="0"/>
-          <w:i w:val="0"/>
-          <w:sz w:val="20"/>
-        </w:rPr>
-        <w:t>Formal study and linguistic immersion; professional working proficiency in Spanish.</w:t>
-      </w:r>
-    </w:p>
-    <w:p>
-      <w:pPr>
-        <w:keepNext/>
-        <w:widowControl/>
-        <w:spacing w:before="60" w:after="20" w:line="264" w:lineRule="auto"/>
-      </w:pPr>
-      <w:r>
-        <w:rPr>
-          <w:rFonts w:ascii="Calibri" w:hAnsi="Calibri" w:eastAsia="Calibri" w:cs="Calibri"/>
-          <w:b/>
-          <w:sz w:val="20"/>
-        </w:rPr>
-        <w:t>Electronic Music &amp; Musicianship Studies — Italian Conservatory</w:t>
-      </w:r>
-      <w:r>
-        <w:rPr>
-          <w:rFonts w:ascii="Calibri" w:hAnsi="Calibri" w:eastAsia="Calibri" w:cs="Calibri"/>
-          <w:b w:val="0"/>
-          <w:sz w:val="20"/>
-        </w:rPr>
-        <w:t xml:space="preserve"> — Italy | c. 2004–2009</w:t>
-      </w:r>
-    </w:p>
-    <w:p>
-      <w:pPr>
-        <w:keepNext w:val="0"/>
-        <w:widowControl/>
-        <w:spacing w:before="0" w:after="60" w:line="264" w:lineRule="auto"/>
-      </w:pPr>
-      <w:r>
-        <w:rPr>
-          <w:rFonts w:ascii="Calibri" w:hAnsi="Calibri" w:eastAsia="Calibri" w:cs="Calibri"/>
-          <w:b w:val="0"/>
-          <w:i w:val="0"/>
-          <w:sz w:val="20"/>
-        </w:rPr>
-        <w:t>Theory, solfeggio, harmony, analysis, electronic music, synthesis and technology-assisted composition.</w:t>
-      </w:r>
-    </w:p>
-    <w:p>
-      <w:pPr>
-        <w:keepNext/>
-        <w:widowControl/>
-        <w:spacing w:before="60" w:after="20" w:line="264" w:lineRule="auto"/>
-      </w:pPr>
-      <w:r>
-        <w:rPr>
-          <w:rFonts w:ascii="Calibri" w:hAnsi="Calibri" w:eastAsia="Calibri" w:cs="Calibri"/>
-          <w:b/>
-          <w:sz w:val="20"/>
-        </w:rPr>
-        <w:t>Scientific High School Diploma — Liceo Scientifico</w:t>
-      </w:r>
-      <w:r>
-        <w:rPr>
-          <w:rFonts w:ascii="Calibri" w:hAnsi="Calibri" w:eastAsia="Calibri" w:cs="Calibri"/>
-          <w:b w:val="0"/>
-          <w:sz w:val="20"/>
-        </w:rPr>
-        <w:t xml:space="preserve"> — Italy | c. 2007–2012</w:t>
-      </w:r>
-    </w:p>
-    <w:p>
-      <w:pPr>
-        <w:keepNext w:val="0"/>
-        <w:widowControl/>
-        <w:spacing w:before="0" w:after="60" w:line="264" w:lineRule="auto"/>
-      </w:pPr>
-      <w:r>
-        <w:rPr>
-          <w:rFonts w:ascii="Calibri" w:hAnsi="Calibri" w:eastAsia="Calibri" w:cs="Calibri"/>
-          <w:b w:val="0"/>
-          <w:i w:val="0"/>
-          <w:sz w:val="20"/>
-        </w:rPr>
-        <w:t>Mathematics, physics, natural sciences, literature, history, philosophy and Latin.</w:t>
-      </w:r>
-    </w:p>
-    <w:p>
-      <w:pPr>
-        <w:keepNext/>
-        <w:widowControl/>
-        <w:spacing w:before="200" w:after="80" w:line="264" w:lineRule="auto"/>
-        <w:pBdr>
-          <w:bottom w:val="single" w:sz="6" w:space="1" w:color="666666"/>
-        </w:pBdr>
-      </w:pPr>
-      <w:r>
-        <w:rPr>
-          <w:rFonts w:ascii="Calibri" w:hAnsi="Calibri" w:eastAsia="Calibri" w:cs="Calibri"/>
-          <w:b/>
-          <w:i w:val="0"/>
           <w:sz w:val="22"/>
+          <w:u w:val="single"/>
         </w:rPr>
         <w:t>LANGUAGES</w:t>
       </w:r>
     </w:p>
     <w:p>
       <w:pPr>
-        <w:keepNext w:val="0"/>
-        <w:widowControl/>
-        <w:spacing w:before="0" w:after="60" w:line="264" w:lineRule="auto"/>
+        <w:spacing w:before="0" w:after="40" w:line="264" w:lineRule="auto"/>
       </w:pPr>
       <w:r>
         <w:rPr>
-          <w:rFonts w:ascii="Calibri" w:hAnsi="Calibri" w:eastAsia="Calibri" w:cs="Calibri"/>
-          <w:b w:val="0"/>
-          <w:i w:val="0"/>
+          <w:rFonts w:ascii="Calibri" w:hAnsi="Calibri" w:cs="Calibri"/>
           <w:sz w:val="20"/>
         </w:rPr>
-        <w:t>Italian: Native  |  English: Full professional proficiency; IELTS certified  |  Spanish: Professional working proficiency.</w:t>
+        <w:t>Italian: Native | English: Full professional proficiency; IELTS certified | Spanish: Professional working proficiency</w:t>
       </w:r>
     </w:p>
     <w:p>
       <w:pPr>
         <w:keepNext/>
-        <w:widowControl/>
         <w:spacing w:before="200" w:after="80" w:line="264" w:lineRule="auto"/>
-        <w:pBdr>
-          <w:bottom w:val="single" w:sz="6" w:space="1" w:color="666666"/>
-        </w:pBdr>
       </w:pPr>
       <w:r>
         <w:rPr>
-          <w:rFonts w:ascii="Calibri" w:hAnsi="Calibri" w:eastAsia="Calibri" w:cs="Calibri"/>
+          <w:rFonts w:ascii="Calibri" w:hAnsi="Calibri" w:cs="Calibri"/>
           <w:b/>
-          <w:i w:val="0"/>
           <w:sz w:val="22"/>
+          <w:u w:val="single"/>
         </w:rPr>
-        <w:t>ADDITIONAL INFORMATION</w:t>
+        <w:t>TECHNICAL SETUP, RECOGNITION &amp; ADDITIONAL INFORMATION</w:t>
       </w:r>
     </w:p>
     <w:p>
       <w:pPr>
         <w:pStyle w:val="ListBullet"/>
-        <w:keepNext w:val="0"/>
-        <w:widowControl/>
         <w:spacing w:before="0" w:after="40" w:line="264" w:lineRule="auto"/>
-        <w:ind w:left="360" w:hanging="216"/>
       </w:pPr>
       <w:r>
         <w:rPr>
-          <w:rFonts w:ascii="Calibri" w:hAnsi="Calibri" w:eastAsia="Calibri" w:cs="Calibri"/>
-          <w:b w:val="0"/>
+          <w:rFonts w:ascii="Calibri" w:hAnsi="Calibri" w:cs="Calibri"/>
           <w:sz w:val="20"/>
         </w:rPr>
-        <w:t>Additional technical skills: Blender 3D modelling, Arduino prototyping, wearable music controllers, Unity, projection mapping and interactive audiovisual installations.</w:t>
+        <w:t>Equipped for remote audio-evaluation work with Beyerdynamic DT 990 Pro headphones, Genelec M040 speakers, Universal Audio Apollo Quad, Lewitt LCT 640 microphone and a dedicated listening environment; NVIDIA RTX 3080 Ti and RTX 3070 systems plus Apple M4 Pro (48 GB) and Intel Mac systems for Metal, MPS, MLX and GGUF local-model evaluation.</w:t>
       </w:r>
     </w:p>
     <w:p>
       <w:pPr>
         <w:pStyle w:val="ListBullet"/>
-        <w:keepNext w:val="0"/>
-        <w:widowControl/>
         <w:spacing w:before="0" w:after="40" w:line="264" w:lineRule="auto"/>
-        <w:ind w:left="360" w:hanging="216"/>
       </w:pPr>
       <w:r>
         <w:rPr>
-          <w:rFonts w:ascii="Calibri" w:hAnsi="Calibri" w:eastAsia="Calibri" w:cs="Calibri"/>
+          <w:rFonts w:ascii="Calibri" w:hAnsi="Calibri" w:cs="Calibri"/>
           <w:b w:val="0"/>
           <w:sz w:val="20"/>
         </w:rPr>
-        <w:t>Equipped for remote audio-evaluation work with Beyerdynamic DT 990 Pro headphones, Genelec M040 speakers, Universal Audio Apollo Quad, Lewitt LCT 640 microphone, and a dedicated listening environment; NVIDIA RTX 3080 Ti / 3070 and Apple M4 Pro (48 GB) plus Intel Mac systems for Metal, MPS, MLX and GGUF local-model evaluation.</w:t>
-      </w:r>
-    </w:p>
-    <w:p>
-      <w:pPr>
-        <w:pStyle w:val="ListBullet"/>
-        <w:keepNext w:val="0"/>
-        <w:widowControl/>
-        <w:spacing w:before="0" w:after="40" w:line="264" w:lineRule="auto"/>
-        <w:ind w:left="360" w:hanging="216"/>
-      </w:pPr>
-      <w:r>
-        <w:rPr>
-          <w:rFonts w:ascii="Calibri" w:hAnsi="Calibri" w:eastAsia="Calibri" w:cs="Calibri"/>
-          <w:b w:val="0"/>
-          <w:sz w:val="20"/>
-        </w:rPr>
-        <w:t>Public communication experience includes media interviews, product demonstrations, technical documentation and promotional content.</w:t>
-      </w:r>
-    </w:p>
-    <w:p>
-      <w:pPr>
-        <w:pStyle w:val="ListBullet"/>
-        <w:keepNext w:val="0"/>
-        <w:widowControl/>
-        <w:spacing w:before="0" w:after="40" w:line="264" w:lineRule="auto"/>
-        <w:ind w:left="360" w:hanging="216"/>
-      </w:pPr>
-      <w:r>
-        <w:rPr>
-          <w:rFonts w:ascii="Calibri" w:hAnsi="Calibri"/>
-          <w:sz w:val="20"/>
-        </w:rPr>
-        <w:t xml:space="preserve">Products covered in industry press including </w:t>
+        <w:t xml:space="preserve">Products covered by specialist industry publications including </w:t>
       </w:r>
       <w:hyperlink r:id="rId18">
         <w:r>
@@ -1368,37 +999,19 @@
             <w:rFonts w:ascii="Calibri" w:hAnsi="Calibri" w:cs="Calibri"/>
             <w:sz w:val="20"/>
             <w:szCs w:val="20"/>
-            <w:color w:val="0563C1" w:themeColor="hyperlink"/>
             <w:u w:val="single"/>
+            <w:color w:val="0563C1"/>
           </w:rPr>
           <w:t xml:space="preserve">Sound On Sound</w:t>
         </w:r>
       </w:hyperlink>
       <w:r>
         <w:rPr>
-          <w:rFonts w:ascii="Calibri" w:hAnsi="Calibri"/>
+          <w:rFonts w:ascii="Calibri" w:hAnsi="Calibri" w:cs="Calibri"/>
+          <w:b w:val="0"/>
           <w:sz w:val="20"/>
         </w:rPr>
-        <w:t xml:space="preserve"> (</w:t>
-      </w:r>
-      <w:hyperlink r:id="rId18">
-        <w:r>
-          <w:rPr>
-            <w:rFonts w:ascii="Calibri" w:hAnsi="Calibri" w:cs="Calibri"/>
-            <w:sz w:val="20"/>
-            <w:szCs w:val="20"/>
-            <w:color w:val="0563C1" w:themeColor="hyperlink"/>
-            <w:u w:val="single"/>
-          </w:rPr>
-          <w:t xml:space="preserve">Dynamic Split Module</w:t>
-        </w:r>
-      </w:hyperlink>
-      <w:r>
-        <w:rPr>
-          <w:rFonts w:ascii="Calibri" w:hAnsi="Calibri"/>
-          <w:sz w:val="20"/>
-        </w:rPr>
-        <w:t xml:space="preserve">) and </w:t>
+        <w:t xml:space="preserve"> and </w:t>
       </w:r>
       <w:hyperlink r:id="rId19">
         <w:r>
@@ -1406,34 +1019,16 @@
             <w:rFonts w:ascii="Calibri" w:hAnsi="Calibri" w:cs="Calibri"/>
             <w:sz w:val="20"/>
             <w:szCs w:val="20"/>
-            <w:color w:val="0563C1" w:themeColor="hyperlink"/>
             <w:u w:val="single"/>
+            <w:color w:val="0563C1"/>
           </w:rPr>
           <w:t xml:space="preserve">Gearnews</w:t>
         </w:r>
       </w:hyperlink>
       <w:r>
         <w:rPr>
-          <w:rFonts w:ascii="Calibri" w:hAnsi="Calibri"/>
-          <w:sz w:val="20"/>
-        </w:rPr>
-        <w:t xml:space="preserve"> (</w:t>
-      </w:r>
-      <w:hyperlink r:id="rId19">
-        <w:r>
-          <w:rPr>
-            <w:rFonts w:ascii="Calibri" w:hAnsi="Calibri" w:cs="Calibri"/>
-            <w:sz w:val="20"/>
-            <w:szCs w:val="20"/>
-            <w:color w:val="0563C1" w:themeColor="hyperlink"/>
-            <w:u w:val="single"/>
-          </w:rPr>
-          <w:t xml:space="preserve">Dynamic Split Module</w:t>
-        </w:r>
-      </w:hyperlink>
-      <w:r>
-        <w:rPr>
-          <w:rFonts w:ascii="Calibri" w:hAnsi="Calibri"/>
+          <w:rFonts w:ascii="Calibri" w:hAnsi="Calibri" w:cs="Calibri"/>
+          <w:b w:val="0"/>
           <w:sz w:val="20"/>
         </w:rPr>
         <w:t xml:space="preserve">; </w:t>
@@ -1444,32 +1039,42 @@
             <w:rFonts w:ascii="Calibri" w:hAnsi="Calibri" w:cs="Calibri"/>
             <w:sz w:val="20"/>
             <w:szCs w:val="20"/>
-            <w:color w:val="0563C1" w:themeColor="hyperlink"/>
             <w:u w:val="single"/>
+            <w:color w:val="0563C1"/>
           </w:rPr>
           <w:t xml:space="preserve">Pendolo</w:t>
         </w:r>
       </w:hyperlink>
       <w:r>
         <w:rPr>
-          <w:rFonts w:ascii="Calibri" w:hAnsi="Calibri"/>
+          <w:rFonts w:ascii="Calibri" w:hAnsi="Calibri" w:cs="Calibri"/>
+          <w:b w:val="0"/>
           <w:sz w:val="20"/>
         </w:rPr>
-        <w:t xml:space="preserve">).</w:t>
+        <w:t xml:space="preserve"> also covered by Gearnews.</w:t>
       </w:r>
     </w:p>
     <w:p>
       <w:pPr>
         <w:pStyle w:val="ListBullet"/>
-        <w:keepNext w:val="0"/>
-        <w:widowControl/>
         <w:spacing w:before="0" w:after="40" w:line="264" w:lineRule="auto"/>
-        <w:ind w:left="360" w:hanging="216"/>
       </w:pPr>
       <w:r>
         <w:rPr>
-          <w:rFonts w:ascii="Calibri" w:hAnsi="Calibri" w:eastAsia="Calibri" w:cs="Calibri"/>
-          <w:b w:val="0"/>
+          <w:rFonts w:ascii="Calibri" w:hAnsi="Calibri" w:cs="Calibri"/>
+          <w:sz w:val="20"/>
+        </w:rPr>
+        <w:t>Additional technical skills: Blender, Arduino prototyping, Unity, projection mapping and interactive audiovisual installations.</w:t>
+      </w:r>
+    </w:p>
+    <w:p>
+      <w:pPr>
+        <w:pStyle w:val="ListBullet"/>
+        <w:spacing w:before="0" w:after="40" w:line="264" w:lineRule="auto"/>
+      </w:pPr>
+      <w:r>
+        <w:rPr>
+          <w:rFonts w:ascii="Calibri" w:hAnsi="Calibri" w:cs="Calibri"/>
           <w:sz w:val="20"/>
         </w:rPr>
         <w:t>Based in London with the right to live and work in the United Kingdom.</w:t>

</xml_diff>

<commit_message>
Fit Alignerr CV to exactly 2 pages via tighter spacing and margins.
</commit_message>
<xml_diff>
--- a/Agostino_Scalzullo_Alignerr_CV.docx
+++ b/Agostino_Scalzullo_Alignerr_CV.docx
@@ -4,7 +4,7 @@
   <w:body>
     <w:p>
       <w:pPr>
-        <w:spacing w:before="0" w:after="40" w:line="264" w:lineRule="auto"/>
+        <w:spacing w:before="0" w:after="40" w:line="252" w:lineRule="auto"/>
         <w:jc w:val="center"/>
       </w:pPr>
       <w:r>
@@ -18,7 +18,7 @@
     </w:p>
     <w:p>
       <w:pPr>
-        <w:spacing w:before="0" w:after="20" w:line="264" w:lineRule="auto"/>
+        <w:spacing w:before="0" w:after="20" w:line="252" w:lineRule="auto"/>
         <w:jc w:val="center"/>
       </w:pPr>
       <w:r>
@@ -43,7 +43,7 @@
     </w:p>
     <w:p>
       <w:pPr>
-        <w:spacing w:before="0" w:after="20" w:line="264" w:lineRule="auto"/>
+        <w:spacing w:before="0" w:after="20" w:line="252" w:lineRule="auto"/>
         <w:jc w:val="center"/>
       </w:pPr>
       <w:r>
@@ -68,7 +68,7 @@
     </w:p>
     <w:p>
       <w:pPr>
-        <w:spacing w:before="0" w:after="20" w:line="264" w:lineRule="auto"/>
+        <w:spacing w:before="0" w:after="20" w:line="252" w:lineRule="auto"/>
         <w:jc w:val="center"/>
       </w:pPr>
       <w:hyperlink r:id="rId14">
@@ -143,7 +143,7 @@
     </w:p>
     <w:p>
       <w:pPr>
-        <w:spacing w:before="80" w:after="120" w:line="264" w:lineRule="auto"/>
+        <w:spacing w:before="60" w:after="80" w:line="252" w:lineRule="auto"/>
         <w:jc w:val="center"/>
       </w:pPr>
       <w:r>
@@ -158,7 +158,7 @@
     <w:p>
       <w:pPr>
         <w:keepNext/>
-        <w:spacing w:before="200" w:after="80" w:line="264" w:lineRule="auto"/>
+        <w:spacing w:before="140" w:after="60" w:line="252" w:lineRule="auto"/>
       </w:pPr>
       <w:r>
         <w:rPr>
@@ -172,7 +172,7 @@
     </w:p>
     <w:p>
       <w:pPr>
-        <w:spacing w:before="0" w:after="60" w:line="264" w:lineRule="auto"/>
+        <w:spacing w:before="0" w:after="30" w:line="252" w:lineRule="auto"/>
       </w:pPr>
       <w:r>
         <w:rPr>
@@ -223,7 +223,7 @@
     <w:p>
       <w:pPr>
         <w:keepNext/>
-        <w:spacing w:before="200" w:after="80" w:line="264" w:lineRule="auto"/>
+        <w:spacing w:before="140" w:after="60" w:line="252" w:lineRule="auto"/>
       </w:pPr>
       <w:r>
         <w:rPr>
@@ -237,7 +237,7 @@
     </w:p>
     <w:p>
       <w:pPr>
-        <w:spacing w:before="0" w:after="60" w:line="264" w:lineRule="auto"/>
+        <w:spacing w:before="0" w:after="30" w:line="252" w:lineRule="auto"/>
       </w:pPr>
       <w:r>
         <w:rPr>
@@ -258,7 +258,7 @@
     </w:p>
     <w:p>
       <w:pPr>
-        <w:spacing w:before="0" w:after="60" w:line="264" w:lineRule="auto"/>
+        <w:spacing w:before="0" w:after="30" w:line="252" w:lineRule="auto"/>
       </w:pPr>
       <w:r>
         <w:rPr>
@@ -279,7 +279,7 @@
     </w:p>
     <w:p>
       <w:pPr>
-        <w:spacing w:before="0" w:after="60" w:line="264" w:lineRule="auto"/>
+        <w:spacing w:before="0" w:after="30" w:line="252" w:lineRule="auto"/>
       </w:pPr>
       <w:r>
         <w:rPr>
@@ -300,7 +300,7 @@
     </w:p>
     <w:p>
       <w:pPr>
-        <w:spacing w:before="0" w:after="60" w:line="264" w:lineRule="auto"/>
+        <w:spacing w:before="0" w:after="30" w:line="252" w:lineRule="auto"/>
       </w:pPr>
       <w:r>
         <w:rPr>
@@ -322,7 +322,7 @@
     <w:p>
       <w:pPr>
         <w:keepNext/>
-        <w:spacing w:before="200" w:after="80" w:line="264" w:lineRule="auto"/>
+        <w:spacing w:before="140" w:after="60" w:line="252" w:lineRule="auto"/>
       </w:pPr>
       <w:r>
         <w:rPr>
@@ -337,7 +337,7 @@
     <w:p>
       <w:pPr>
         <w:keepNext/>
-        <w:spacing w:before="140" w:after="0" w:line="264" w:lineRule="auto"/>
+        <w:spacing w:before="100" w:after="0" w:line="252" w:lineRule="auto"/>
       </w:pPr>
       <w:r>
         <w:rPr>
@@ -364,7 +364,7 @@
     <w:p>
       <w:pPr>
         <w:keepNext/>
-        <w:spacing w:before="0" w:after="40" w:line="264" w:lineRule="auto"/>
+        <w:spacing w:before="0" w:after="20" w:line="252" w:lineRule="auto"/>
       </w:pPr>
       <w:r>
         <w:rPr>
@@ -378,7 +378,7 @@
     <w:p>
       <w:pPr>
         <w:pStyle w:val="ListBullet"/>
-        <w:spacing w:before="0" w:after="40" w:line="264" w:lineRule="auto"/>
+        <w:spacing w:before="0" w:after="30" w:line="252" w:lineRule="auto"/>
       </w:pPr>
       <w:r>
         <w:rPr>
@@ -391,7 +391,7 @@
     <w:p>
       <w:pPr>
         <w:pStyle w:val="ListBullet"/>
-        <w:spacing w:before="0" w:after="40" w:line="264" w:lineRule="auto"/>
+        <w:spacing w:before="0" w:after="30" w:line="252" w:lineRule="auto"/>
       </w:pPr>
       <w:r>
         <w:rPr>
@@ -404,7 +404,7 @@
     <w:p>
       <w:pPr>
         <w:pStyle w:val="ListBullet"/>
-        <w:spacing w:before="0" w:after="40" w:line="264" w:lineRule="auto"/>
+        <w:spacing w:before="0" w:after="30" w:line="252" w:lineRule="auto"/>
       </w:pPr>
       <w:r>
         <w:rPr>
@@ -417,7 +417,7 @@
     <w:p>
       <w:pPr>
         <w:pStyle w:val="ListBullet"/>
-        <w:spacing w:before="0" w:after="40" w:line="264" w:lineRule="auto"/>
+        <w:spacing w:before="0" w:after="30" w:line="252" w:lineRule="auto"/>
       </w:pPr>
       <w:r>
         <w:rPr>
@@ -430,7 +430,7 @@
     <w:p>
       <w:pPr>
         <w:keepNext/>
-        <w:spacing w:before="140" w:after="0" w:line="264" w:lineRule="auto"/>
+        <w:spacing w:before="100" w:after="0" w:line="252" w:lineRule="auto"/>
       </w:pPr>
       <w:r>
         <w:rPr>
@@ -457,7 +457,7 @@
     <w:p>
       <w:pPr>
         <w:keepNext/>
-        <w:spacing w:before="0" w:after="40" w:line="264" w:lineRule="auto"/>
+        <w:spacing w:before="0" w:after="20" w:line="252" w:lineRule="auto"/>
       </w:pPr>
       <w:r>
         <w:rPr>
@@ -471,7 +471,7 @@
     <w:p>
       <w:pPr>
         <w:pStyle w:val="ListBullet"/>
-        <w:spacing w:before="0" w:after="40" w:line="264" w:lineRule="auto"/>
+        <w:spacing w:before="0" w:after="30" w:line="252" w:lineRule="auto"/>
       </w:pPr>
       <w:r>
         <w:rPr>
@@ -484,7 +484,7 @@
     <w:p>
       <w:pPr>
         <w:pStyle w:val="ListBullet"/>
-        <w:spacing w:before="0" w:after="40" w:line="264" w:lineRule="auto"/>
+        <w:spacing w:before="0" w:after="30" w:line="252" w:lineRule="auto"/>
       </w:pPr>
       <w:r>
         <w:rPr>
@@ -497,7 +497,7 @@
     <w:p>
       <w:pPr>
         <w:pStyle w:val="ListBullet"/>
-        <w:spacing w:before="0" w:after="40" w:line="264" w:lineRule="auto"/>
+        <w:spacing w:before="0" w:after="30" w:line="252" w:lineRule="auto"/>
       </w:pPr>
       <w:r>
         <w:rPr>
@@ -510,7 +510,7 @@
     <w:p>
       <w:pPr>
         <w:pStyle w:val="ListBullet"/>
-        <w:spacing w:before="0" w:after="40" w:line="264" w:lineRule="auto"/>
+        <w:spacing w:before="0" w:after="30" w:line="252" w:lineRule="auto"/>
       </w:pPr>
       <w:r>
         <w:rPr>
@@ -564,7 +564,7 @@
     <w:p>
       <w:pPr>
         <w:pStyle w:val="ListBullet"/>
-        <w:spacing w:before="0" w:after="40" w:line="264" w:lineRule="auto"/>
+        <w:spacing w:before="0" w:after="30" w:line="252" w:lineRule="auto"/>
       </w:pPr>
       <w:r>
         <w:rPr>
@@ -598,7 +598,7 @@
     <w:p>
       <w:pPr>
         <w:keepNext/>
-        <w:spacing w:before="140" w:after="0" w:line="264" w:lineRule="auto"/>
+        <w:spacing w:before="100" w:after="0" w:line="252" w:lineRule="auto"/>
       </w:pPr>
       <w:r>
         <w:rPr>
@@ -612,7 +612,7 @@
     <w:p>
       <w:pPr>
         <w:keepNext/>
-        <w:spacing w:before="0" w:after="40" w:line="264" w:lineRule="auto"/>
+        <w:spacing w:before="0" w:after="30" w:line="252" w:lineRule="auto"/>
       </w:pPr>
       <w:r>
         <w:rPr>
@@ -626,7 +626,7 @@
     <w:p>
       <w:pPr>
         <w:pStyle w:val="ListBullet"/>
-        <w:spacing w:before="0" w:after="40" w:line="264" w:lineRule="auto"/>
+        <w:spacing w:before="0" w:after="30" w:line="252" w:lineRule="auto"/>
       </w:pPr>
       <w:r>
         <w:rPr>
@@ -639,7 +639,7 @@
     <w:p>
       <w:pPr>
         <w:pStyle w:val="ListBullet"/>
-        <w:spacing w:before="0" w:after="40" w:line="264" w:lineRule="auto"/>
+        <w:spacing w:before="0" w:after="30" w:line="252" w:lineRule="auto"/>
       </w:pPr>
       <w:r>
         <w:rPr>
@@ -652,7 +652,7 @@
     <w:p>
       <w:pPr>
         <w:pStyle w:val="ListBullet"/>
-        <w:spacing w:before="0" w:after="40" w:line="264" w:lineRule="auto"/>
+        <w:spacing w:before="0" w:after="30" w:line="252" w:lineRule="auto"/>
       </w:pPr>
       <w:r>
         <w:rPr>
@@ -665,7 +665,7 @@
     <w:p>
       <w:pPr>
         <w:keepNext/>
-        <w:spacing w:before="200" w:after="80" w:line="264" w:lineRule="auto"/>
+        <w:spacing w:before="140" w:after="60" w:line="252" w:lineRule="auto"/>
       </w:pPr>
       <w:r>
         <w:rPr>
@@ -680,7 +680,7 @@
     <w:p>
       <w:pPr>
         <w:keepNext/>
-        <w:spacing w:before="100" w:after="20" w:line="264" w:lineRule="auto"/>
+        <w:spacing w:before="60" w:after="20" w:line="252" w:lineRule="auto"/>
       </w:pPr>
       <w:hyperlink r:id="rId13">
         <w:r>
@@ -698,7 +698,7 @@
     </w:p>
     <w:p>
       <w:pPr>
-        <w:spacing w:before="0" w:after="40" w:line="264" w:lineRule="auto"/>
+        <w:spacing w:before="0" w:after="30" w:line="252" w:lineRule="auto"/>
       </w:pPr>
       <w:r>
         <w:rPr>
@@ -711,7 +711,7 @@
     <w:p>
       <w:pPr>
         <w:pStyle w:val="ListBullet"/>
-        <w:spacing w:before="0" w:after="40" w:line="264" w:lineRule="auto"/>
+        <w:spacing w:before="0" w:after="30" w:line="252" w:lineRule="auto"/>
       </w:pPr>
       <w:r>
         <w:rPr>
@@ -724,7 +724,7 @@
     <w:p>
       <w:pPr>
         <w:pStyle w:val="ListBullet"/>
-        <w:spacing w:before="0" w:after="40" w:line="264" w:lineRule="auto"/>
+        <w:spacing w:before="0" w:after="30" w:line="252" w:lineRule="auto"/>
       </w:pPr>
       <w:r>
         <w:rPr>
@@ -737,7 +737,7 @@
     <w:p>
       <w:pPr>
         <w:pStyle w:val="ListBullet"/>
-        <w:spacing w:before="0" w:after="40" w:line="264" w:lineRule="auto"/>
+        <w:spacing w:before="0" w:after="30" w:line="252" w:lineRule="auto"/>
       </w:pPr>
       <w:r>
         <w:rPr>
@@ -750,7 +750,7 @@
     <w:p>
       <w:pPr>
         <w:keepNext/>
-        <w:spacing w:before="100" w:after="20" w:line="264" w:lineRule="auto"/>
+        <w:spacing w:before="60" w:after="20" w:line="252" w:lineRule="auto"/>
       </w:pPr>
       <w:hyperlink r:id="rId15">
         <w:r>
@@ -769,7 +769,7 @@
     <w:p>
       <w:pPr>
         <w:pStyle w:val="ListBullet"/>
-        <w:spacing w:before="0" w:after="40" w:line="264" w:lineRule="auto"/>
+        <w:spacing w:before="0" w:after="30" w:line="252" w:lineRule="auto"/>
       </w:pPr>
       <w:r>
         <w:rPr>
@@ -782,7 +782,7 @@
     <w:p>
       <w:pPr>
         <w:pStyle w:val="ListBullet"/>
-        <w:spacing w:before="0" w:after="40" w:line="264" w:lineRule="auto"/>
+        <w:spacing w:before="0" w:after="30" w:line="252" w:lineRule="auto"/>
       </w:pPr>
       <w:r>
         <w:rPr>
@@ -795,7 +795,7 @@
     <w:p>
       <w:pPr>
         <w:keepNext/>
-        <w:spacing w:before="100" w:after="20" w:line="264" w:lineRule="auto"/>
+        <w:spacing w:before="60" w:after="20" w:line="252" w:lineRule="auto"/>
       </w:pPr>
       <w:r>
         <w:rPr>
@@ -808,7 +808,7 @@
     </w:p>
     <w:p>
       <w:pPr>
-        <w:spacing w:before="0" w:after="40" w:line="264" w:lineRule="auto"/>
+        <w:spacing w:before="0" w:after="30" w:line="252" w:lineRule="auto"/>
       </w:pPr>
       <w:r>
         <w:rPr>
@@ -821,7 +821,7 @@
     <w:p>
       <w:pPr>
         <w:pStyle w:val="ListBullet"/>
-        <w:spacing w:before="0" w:after="40" w:line="264" w:lineRule="auto"/>
+        <w:spacing w:before="0" w:after="30" w:line="252" w:lineRule="auto"/>
       </w:pPr>
       <w:r>
         <w:rPr>
@@ -834,7 +834,7 @@
     <w:p>
       <w:pPr>
         <w:keepNext/>
-        <w:spacing w:before="100" w:after="20" w:line="264" w:lineRule="auto"/>
+        <w:spacing w:before="60" w:after="20" w:line="252" w:lineRule="auto"/>
       </w:pPr>
       <w:hyperlink r:id="rId16">
         <w:r>
@@ -852,7 +852,7 @@
     </w:p>
     <w:p>
       <w:pPr>
-        <w:spacing w:before="0" w:after="40" w:line="264" w:lineRule="auto"/>
+        <w:spacing w:before="0" w:after="30" w:line="252" w:lineRule="auto"/>
       </w:pPr>
       <w:r>
         <w:rPr>
@@ -865,7 +865,7 @@
     <w:p>
       <w:pPr>
         <w:keepNext/>
-        <w:spacing w:before="200" w:after="80" w:line="264" w:lineRule="auto"/>
+        <w:spacing w:before="140" w:after="60" w:line="252" w:lineRule="auto"/>
       </w:pPr>
       <w:r>
         <w:rPr>
@@ -879,7 +879,7 @@
     </w:p>
     <w:p>
       <w:pPr>
-        <w:spacing w:before="0" w:after="40" w:line="264" w:lineRule="auto"/>
+        <w:spacing w:before="0" w:after="30" w:line="252" w:lineRule="auto"/>
       </w:pPr>
       <w:r>
         <w:rPr>
@@ -891,7 +891,7 @@
     </w:p>
     <w:p>
       <w:pPr>
-        <w:spacing w:before="0" w:after="40" w:line="264" w:lineRule="auto"/>
+        <w:spacing w:before="0" w:after="30" w:line="252" w:lineRule="auto"/>
       </w:pPr>
       <w:r>
         <w:rPr>
@@ -903,7 +903,7 @@
     </w:p>
     <w:p>
       <w:pPr>
-        <w:spacing w:before="0" w:after="40" w:line="264" w:lineRule="auto"/>
+        <w:spacing w:before="0" w:after="30" w:line="252" w:lineRule="auto"/>
       </w:pPr>
       <w:r>
         <w:rPr>
@@ -915,7 +915,7 @@
     </w:p>
     <w:p>
       <w:pPr>
-        <w:spacing w:before="0" w:after="40" w:line="264" w:lineRule="auto"/>
+        <w:spacing w:before="0" w:after="30" w:line="252" w:lineRule="auto"/>
       </w:pPr>
       <w:r>
         <w:rPr>
@@ -928,7 +928,7 @@
     <w:p>
       <w:pPr>
         <w:keepNext/>
-        <w:spacing w:before="200" w:after="80" w:line="264" w:lineRule="auto"/>
+        <w:spacing w:before="140" w:after="60" w:line="252" w:lineRule="auto"/>
       </w:pPr>
       <w:r>
         <w:rPr>
@@ -942,7 +942,7 @@
     </w:p>
     <w:p>
       <w:pPr>
-        <w:spacing w:before="0" w:after="40" w:line="264" w:lineRule="auto"/>
+        <w:spacing w:before="0" w:after="30" w:line="252" w:lineRule="auto"/>
       </w:pPr>
       <w:r>
         <w:rPr>
@@ -955,7 +955,7 @@
     <w:p>
       <w:pPr>
         <w:keepNext/>
-        <w:spacing w:before="200" w:after="80" w:line="264" w:lineRule="auto"/>
+        <w:spacing w:before="140" w:after="60" w:line="252" w:lineRule="auto"/>
       </w:pPr>
       <w:r>
         <w:rPr>
@@ -970,7 +970,7 @@
     <w:p>
       <w:pPr>
         <w:pStyle w:val="ListBullet"/>
-        <w:spacing w:before="0" w:after="40" w:line="264" w:lineRule="auto"/>
+        <w:spacing w:before="0" w:after="30" w:line="252" w:lineRule="auto"/>
       </w:pPr>
       <w:r>
         <w:rPr>
@@ -983,7 +983,7 @@
     <w:p>
       <w:pPr>
         <w:pStyle w:val="ListBullet"/>
-        <w:spacing w:before="0" w:after="40" w:line="264" w:lineRule="auto"/>
+        <w:spacing w:before="0" w:after="30" w:line="252" w:lineRule="auto"/>
       </w:pPr>
       <w:r>
         <w:rPr>
@@ -1057,7 +1057,7 @@
     <w:p>
       <w:pPr>
         <w:pStyle w:val="ListBullet"/>
-        <w:spacing w:before="0" w:after="40" w:line="264" w:lineRule="auto"/>
+        <w:spacing w:before="0" w:after="30" w:line="252" w:lineRule="auto"/>
       </w:pPr>
       <w:r>
         <w:rPr>
@@ -1070,7 +1070,7 @@
     <w:p>
       <w:pPr>
         <w:pStyle w:val="ListBullet"/>
-        <w:spacing w:before="0" w:after="40" w:line="264" w:lineRule="auto"/>
+        <w:spacing w:before="0" w:after="30" w:line="252" w:lineRule="auto"/>
       </w:pPr>
       <w:r>
         <w:rPr>
@@ -1082,7 +1082,7 @@
     </w:p>
     <w:sectPr>
       <w:pgSz w:w="11906" w:h="16838"/>
-      <w:pgMar w:top="850" w:right="907" w:bottom="850" w:left="907" w:header="720" w:footer="720" w:gutter="0"/>
+      <w:pgMar w:top="680" w:right="794" w:bottom="680" w:left="794" w:header="720" w:footer="720" w:gutter="0"/>
       <w:cols w:space="720"/>
       <w:docGrid w:linePitch="360"/>
     </w:sectPr>

</xml_diff>

<commit_message>
Replace em/en dashes with ASCII hyphen-only punctuation in Alignerr CV.
</commit_message>
<xml_diff>
--- a/Agostino_Scalzullo_Alignerr_CV.docx
+++ b/Agostino_Scalzullo_Alignerr_CV.docx
@@ -345,7 +345,7 @@
           <w:b/>
           <w:sz w:val="21"/>
         </w:rPr>
-        <w:t xml:space="preserve">Founder &amp; Product Director — </w:t>
+        <w:t xml:space="preserve">Founder &amp; Product Director - </w:t>
       </w:r>
       <w:hyperlink r:id="rId12">
         <w:r>
@@ -372,7 +372,7 @@
           <w:b w:val="0"/>
           <w:sz w:val="18"/>
         </w:rPr>
-        <w:t>London, United Kingdom | 2023–Present</w:t>
+        <w:t>London, United Kingdom | 2023-Present</w:t>
       </w:r>
     </w:p>
     <w:p>
@@ -438,7 +438,7 @@
           <w:b/>
           <w:sz w:val="21"/>
         </w:rPr>
-        <w:t xml:space="preserve">Founder &amp; Audio Software Product Developer — </w:t>
+        <w:t xml:space="preserve">Founder &amp; Audio Software Product Developer - </w:t>
       </w:r>
       <w:hyperlink r:id="rId11">
         <w:r>
@@ -465,7 +465,7 @@
           <w:b w:val="0"/>
           <w:sz w:val="18"/>
         </w:rPr>
-        <w:t>London, United Kingdom | 2018–Present</w:t>
+        <w:t>London, United Kingdom | 2018-Present</w:t>
       </w:r>
     </w:p>
     <w:p>
@@ -606,7 +606,7 @@
           <w:b/>
           <w:sz w:val="21"/>
         </w:rPr>
-        <w:t>Founder, Artistic Director &amp; Experience Designer — Macrowave / Cacao Discoteca / Basement</w:t>
+        <w:t>Founder, Artistic Director &amp; Experience Designer - Macrowave / Cacao Discoteca / Basement</w:t>
       </w:r>
     </w:p>
     <w:p>
@@ -620,7 +620,7 @@
           <w:b w:val="0"/>
           <w:sz w:val="18"/>
         </w:rPr>
-        <w:t>Avellino and Montemiletto, Italy | 2014–2016</w:t>
+        <w:t>Avellino and Montemiletto, Italy | 2014-2016</w:t>
       </w:r>
     </w:p>
     <w:p>
@@ -886,7 +886,7 @@
           <w:rFonts w:ascii="Calibri" w:hAnsi="Calibri" w:cs="Calibri"/>
           <w:sz w:val="20"/>
         </w:rPr>
-        <w:t>Music Production — SAE Institute | 2019–2020 — Professional music production, recording, editing, mixing, mastering, sound design and synthesis.</w:t>
+        <w:t>Music Production - SAE Institute | 2019-2020 - Professional music production, recording, editing, mixing, mastering, sound design and synthesis.</w:t>
       </w:r>
     </w:p>
     <w:p>
@@ -898,7 +898,7 @@
           <w:rFonts w:ascii="Calibri" w:hAnsi="Calibri" w:cs="Calibri"/>
           <w:sz w:val="20"/>
         </w:rPr>
-        <w:t>Spanish Language Studies — Valencia, Spain | 2022 — Formal study and linguistic immersion.</w:t>
+        <w:t>Spanish Language Studies - Valencia, Spain | 2022 - Formal study and linguistic immersion.</w:t>
       </w:r>
     </w:p>
     <w:p>
@@ -910,7 +910,7 @@
           <w:rFonts w:ascii="Calibri" w:hAnsi="Calibri" w:cs="Calibri"/>
           <w:sz w:val="20"/>
         </w:rPr>
-        <w:t>Electronic Music &amp; Musicianship — Italian Conservatory | c. 2004–2009 — Theory, solfeggio, harmony, analysis, electronic music and synthesis.</w:t>
+        <w:t>Electronic Music &amp; Musicianship - Italian Conservatory | c. 2004-2009 - Theory, solfeggio, harmony, analysis, electronic music and synthesis.</w:t>
       </w:r>
     </w:p>
     <w:p>
@@ -922,7 +922,7 @@
           <w:rFonts w:ascii="Calibri" w:hAnsi="Calibri" w:cs="Calibri"/>
           <w:sz w:val="20"/>
         </w:rPr>
-        <w:t>Scientific High School Diploma — Liceo Scientifico | Italy | c. 2007–2012 — Mathematics, physics, natural sciences and humanities.</w:t>
+        <w:t>Scientific High School Diploma - Liceo Scientifico | Italy | c. 2007-2012 - Mathematics, physics, natural sciences and humanities.</w:t>
       </w:r>
     </w:p>
     <w:p>
@@ -1081,6 +1081,12 @@
       </w:r>
     </w:p>
     <w:sectPr>
+      <w:headerReference w:type="default" r:id="rId21"/>
+      <w:footerReference w:type="default" r:id="rId22"/>
+      <w:headerReference w:type="first" r:id="rId23"/>
+      <w:footerReference w:type="first" r:id="rId24"/>
+      <w:headerReference w:type="even" r:id="rId25"/>
+      <w:footerReference w:type="even" r:id="rId26"/>
       <w:pgSz w:w="11906" w:h="16838"/>
       <w:pgMar w:top="680" w:right="794" w:bottom="680" w:left="794" w:header="720" w:footer="720" w:gutter="0"/>
       <w:cols w:space="720"/>
@@ -1088,6 +1094,66 @@
     </w:sectPr>
   </w:body>
 </w:document>
+</file>
+
+<file path=word/footer1.xml><?xml version="1.0" encoding="utf-8"?>
+<w:ftr xmlns:m="http://schemas.openxmlformats.org/officeDocument/2006/math" xmlns:mc="http://schemas.openxmlformats.org/markup-compatibility/2006" xmlns:mo="http://schemas.microsoft.com/office/mac/office/2008/main" xmlns:mv="urn:schemas-microsoft-com:mac:vml" xmlns:o="urn:schemas-microsoft-com:office:office" xmlns:r="http://schemas.openxmlformats.org/officeDocument/2006/relationships" xmlns:v="urn:schemas-microsoft-com:vml" xmlns:w10="urn:schemas-microsoft-com:office:word" xmlns:w14="http://schemas.microsoft.com/office/word/2010/wordml" xmlns:w="http://schemas.openxmlformats.org/wordprocessingml/2006/main" xmlns:wne="http://schemas.microsoft.com/office/word/2006/wordml" xmlns:wp14="http://schemas.microsoft.com/office/word/2010/wordprocessingDrawing" xmlns:wp="http://schemas.openxmlformats.org/drawingml/2006/wordprocessingDrawing" xmlns:wpc="http://schemas.microsoft.com/office/word/2010/wordprocessingCanvas" xmlns:wpg="http://schemas.microsoft.com/office/word/2010/wordprocessingGroup" xmlns:wpi="http://schemas.microsoft.com/office/word/2010/wordprocessingInk" xmlns:wps="http://schemas.microsoft.com/office/word/2010/wordprocessingShape" mc:Ignorable="w14 wp14">
+  <w:p>
+    <w:pPr>
+      <w:pStyle w:val="Footer"/>
+    </w:pPr>
+  </w:p>
+</w:ftr>
+</file>
+
+<file path=word/footer2.xml><?xml version="1.0" encoding="utf-8"?>
+<w:ftr xmlns:m="http://schemas.openxmlformats.org/officeDocument/2006/math" xmlns:mc="http://schemas.openxmlformats.org/markup-compatibility/2006" xmlns:mo="http://schemas.microsoft.com/office/mac/office/2008/main" xmlns:mv="urn:schemas-microsoft-com:mac:vml" xmlns:o="urn:schemas-microsoft-com:office:office" xmlns:r="http://schemas.openxmlformats.org/officeDocument/2006/relationships" xmlns:v="urn:schemas-microsoft-com:vml" xmlns:w10="urn:schemas-microsoft-com:office:word" xmlns:w14="http://schemas.microsoft.com/office/word/2010/wordml" xmlns:w="http://schemas.openxmlformats.org/wordprocessingml/2006/main" xmlns:wne="http://schemas.microsoft.com/office/word/2006/wordml" xmlns:wp14="http://schemas.microsoft.com/office/word/2010/wordprocessingDrawing" xmlns:wp="http://schemas.openxmlformats.org/drawingml/2006/wordprocessingDrawing" xmlns:wpc="http://schemas.microsoft.com/office/word/2010/wordprocessingCanvas" xmlns:wpg="http://schemas.microsoft.com/office/word/2010/wordprocessingGroup" xmlns:wpi="http://schemas.microsoft.com/office/word/2010/wordprocessingInk" xmlns:wps="http://schemas.microsoft.com/office/word/2010/wordprocessingShape" mc:Ignorable="w14 wp14">
+  <w:p>
+    <w:pPr>
+      <w:pStyle w:val="Footer"/>
+    </w:pPr>
+  </w:p>
+</w:ftr>
+</file>
+
+<file path=word/footer3.xml><?xml version="1.0" encoding="utf-8"?>
+<w:ftr xmlns:m="http://schemas.openxmlformats.org/officeDocument/2006/math" xmlns:mc="http://schemas.openxmlformats.org/markup-compatibility/2006" xmlns:mo="http://schemas.microsoft.com/office/mac/office/2008/main" xmlns:mv="urn:schemas-microsoft-com:mac:vml" xmlns:o="urn:schemas-microsoft-com:office:office" xmlns:r="http://schemas.openxmlformats.org/officeDocument/2006/relationships" xmlns:v="urn:schemas-microsoft-com:vml" xmlns:w10="urn:schemas-microsoft-com:office:word" xmlns:w14="http://schemas.microsoft.com/office/word/2010/wordml" xmlns:w="http://schemas.openxmlformats.org/wordprocessingml/2006/main" xmlns:wne="http://schemas.microsoft.com/office/word/2006/wordml" xmlns:wp14="http://schemas.microsoft.com/office/word/2010/wordprocessingDrawing" xmlns:wp="http://schemas.openxmlformats.org/drawingml/2006/wordprocessingDrawing" xmlns:wpc="http://schemas.microsoft.com/office/word/2010/wordprocessingCanvas" xmlns:wpg="http://schemas.microsoft.com/office/word/2010/wordprocessingGroup" xmlns:wpi="http://schemas.microsoft.com/office/word/2010/wordprocessingInk" xmlns:wps="http://schemas.microsoft.com/office/word/2010/wordprocessingShape" mc:Ignorable="w14 wp14">
+  <w:p>
+    <w:pPr>
+      <w:pStyle w:val="Footer"/>
+    </w:pPr>
+  </w:p>
+</w:ftr>
+</file>
+
+<file path=word/header1.xml><?xml version="1.0" encoding="utf-8"?>
+<w:hdr xmlns:m="http://schemas.openxmlformats.org/officeDocument/2006/math" xmlns:mc="http://schemas.openxmlformats.org/markup-compatibility/2006" xmlns:mo="http://schemas.microsoft.com/office/mac/office/2008/main" xmlns:mv="urn:schemas-microsoft-com:mac:vml" xmlns:o="urn:schemas-microsoft-com:office:office" xmlns:r="http://schemas.openxmlformats.org/officeDocument/2006/relationships" xmlns:v="urn:schemas-microsoft-com:vml" xmlns:w10="urn:schemas-microsoft-com:office:word" xmlns:w14="http://schemas.microsoft.com/office/word/2010/wordml" xmlns:w="http://schemas.openxmlformats.org/wordprocessingml/2006/main" xmlns:wne="http://schemas.microsoft.com/office/word/2006/wordml" xmlns:wp14="http://schemas.microsoft.com/office/word/2010/wordprocessingDrawing" xmlns:wp="http://schemas.openxmlformats.org/drawingml/2006/wordprocessingDrawing" xmlns:wpc="http://schemas.microsoft.com/office/word/2010/wordprocessingCanvas" xmlns:wpg="http://schemas.microsoft.com/office/word/2010/wordprocessingGroup" xmlns:wpi="http://schemas.microsoft.com/office/word/2010/wordprocessingInk" xmlns:wps="http://schemas.microsoft.com/office/word/2010/wordprocessingShape" mc:Ignorable="w14 wp14">
+  <w:p>
+    <w:pPr>
+      <w:pStyle w:val="Header"/>
+    </w:pPr>
+  </w:p>
+</w:hdr>
+</file>
+
+<file path=word/header2.xml><?xml version="1.0" encoding="utf-8"?>
+<w:hdr xmlns:m="http://schemas.openxmlformats.org/officeDocument/2006/math" xmlns:mc="http://schemas.openxmlformats.org/markup-compatibility/2006" xmlns:mo="http://schemas.microsoft.com/office/mac/office/2008/main" xmlns:mv="urn:schemas-microsoft-com:mac:vml" xmlns:o="urn:schemas-microsoft-com:office:office" xmlns:r="http://schemas.openxmlformats.org/officeDocument/2006/relationships" xmlns:v="urn:schemas-microsoft-com:vml" xmlns:w10="urn:schemas-microsoft-com:office:word" xmlns:w14="http://schemas.microsoft.com/office/word/2010/wordml" xmlns:w="http://schemas.openxmlformats.org/wordprocessingml/2006/main" xmlns:wne="http://schemas.microsoft.com/office/word/2006/wordml" xmlns:wp14="http://schemas.microsoft.com/office/word/2010/wordprocessingDrawing" xmlns:wp="http://schemas.openxmlformats.org/drawingml/2006/wordprocessingDrawing" xmlns:wpc="http://schemas.microsoft.com/office/word/2010/wordprocessingCanvas" xmlns:wpg="http://schemas.microsoft.com/office/word/2010/wordprocessingGroup" xmlns:wpi="http://schemas.microsoft.com/office/word/2010/wordprocessingInk" xmlns:wps="http://schemas.microsoft.com/office/word/2010/wordprocessingShape" mc:Ignorable="w14 wp14">
+  <w:p>
+    <w:pPr>
+      <w:pStyle w:val="Header"/>
+    </w:pPr>
+  </w:p>
+</w:hdr>
+</file>
+
+<file path=word/header3.xml><?xml version="1.0" encoding="utf-8"?>
+<w:hdr xmlns:m="http://schemas.openxmlformats.org/officeDocument/2006/math" xmlns:mc="http://schemas.openxmlformats.org/markup-compatibility/2006" xmlns:mo="http://schemas.microsoft.com/office/mac/office/2008/main" xmlns:mv="urn:schemas-microsoft-com:mac:vml" xmlns:o="urn:schemas-microsoft-com:office:office" xmlns:r="http://schemas.openxmlformats.org/officeDocument/2006/relationships" xmlns:v="urn:schemas-microsoft-com:vml" xmlns:w10="urn:schemas-microsoft-com:office:word" xmlns:w14="http://schemas.microsoft.com/office/word/2010/wordml" xmlns:w="http://schemas.openxmlformats.org/wordprocessingml/2006/main" xmlns:wne="http://schemas.microsoft.com/office/word/2006/wordml" xmlns:wp14="http://schemas.microsoft.com/office/word/2010/wordprocessingDrawing" xmlns:wp="http://schemas.openxmlformats.org/drawingml/2006/wordprocessingDrawing" xmlns:wpc="http://schemas.microsoft.com/office/word/2010/wordprocessingCanvas" xmlns:wpg="http://schemas.microsoft.com/office/word/2010/wordprocessingGroup" xmlns:wpi="http://schemas.microsoft.com/office/word/2010/wordprocessingInk" xmlns:wps="http://schemas.microsoft.com/office/word/2010/wordprocessingShape" mc:Ignorable="w14 wp14">
+  <w:p>
+    <w:pPr>
+      <w:pStyle w:val="Header"/>
+    </w:pPr>
+  </w:p>
+</w:hdr>
 </file>
 
 <file path=word/numbering.xml><?xml version="1.0" encoding="utf-8"?>

</xml_diff>

<commit_message>
Add Cacao Discoteca TV interview link to Alignerr CV materials.
Document the public media appearance as Artistic Director with a YouTube hyperlink on the CV Additional Information section and capabilities notes.
</commit_message>
<xml_diff>
--- a/Agostino_Scalzullo_Alignerr_CV.docx
+++ b/Agostino_Scalzullo_Alignerr_CV.docx
@@ -1075,6 +1075,40 @@
       <w:r>
         <w:rPr>
           <w:rFonts w:ascii="Calibri" w:hAnsi="Calibri" w:cs="Calibri"/>
+          <w:b w:val="0"/>
+          <w:sz w:val="20"/>
+        </w:rPr>
+        <w:t xml:space="preserve">Public media appearance as Artistic Director of Cacao Discoteca (</w:t>
+      </w:r>
+      <w:hyperlink r:id="rId27">
+        <w:r>
+          <w:rPr>
+            <w:rFonts w:ascii="Calibri" w:hAnsi="Calibri" w:cs="Calibri"/>
+            <w:sz w:val="20"/>
+            <w:szCs w:val="20"/>
+            <w:u w:val="single"/>
+            <w:color w:val="0563C1"/>
+          </w:rPr>
+          <w:t xml:space="preserve">TV interview</w:t>
+        </w:r>
+      </w:hyperlink>
+      <w:r>
+        <w:rPr>
+          <w:rFonts w:ascii="Calibri" w:hAnsi="Calibri" w:cs="Calibri"/>
+          <w:b w:val="0"/>
+          <w:sz w:val="20"/>
+        </w:rPr>
+        <w:t xml:space="preserve">).</w:t>
+      </w:r>
+    </w:p>
+    <w:p>
+      <w:pPr>
+        <w:pStyle w:val="ListBullet"/>
+        <w:spacing w:before="0" w:after="30" w:line="252" w:lineRule="auto"/>
+      </w:pPr>
+      <w:r>
+        <w:rPr>
+          <w:rFonts w:ascii="Calibri" w:hAnsi="Calibri" w:cs="Calibri"/>
           <w:sz w:val="20"/>
         </w:rPr>
         <w:t>Based in London with the right to live and work in the United Kingdom.</w:t>

</xml_diff>